<commit_message>
feat(member-profile): convert static docx template to use dynamic placeholders
Replace hardcoded text with template variables for member profile data, including personal info, skills, and goals. This enables automated document generation by populating the template with actual member data.
</commit_message>
<xml_diff>
--- a/app/assets/templates/member_profile_template.docx
+++ b/app/assets/templates/member_profile_template.docx
@@ -261,7 +261,7 @@
         </w:tabs>
         <w:ind w:firstLine="720"/>
         <w:rPr>
-          <w:lang w:eastAsia="ko-KR"/>
+          <w:lang w:val="vi-VN" w:eastAsia="ko-KR"/>
         </w:rPr>
       </w:pPr>
       <w:r>
@@ -291,7 +291,19 @@
       </w:r>
       <w:r>
         <w:rPr>
-          <w:lang w:eastAsia="ko-KR"/>
+          <w:lang w:val="vi-VN" w:eastAsia="ko-KR"/>
+        </w:rPr>
+        <w:t xml:space="preserve"> </w:t>
+      </w:r>
+      <w:r>
+        <w:rPr>
+          <w:lang w:val="vi-VN" w:eastAsia="ko-KR"/>
+        </w:rPr>
+        <w:t>{{ ho_ten }}</w:t>
+      </w:r>
+      <w:r>
+        <w:rPr>
+          <w:lang w:val="vi-VN" w:eastAsia="ko-KR"/>
         </w:rPr>
         <w:tab/>
       </w:r>
@@ -316,9 +328,15 @@
       </w:r>
       <w:r>
         <w:rPr>
-          <w:lang w:eastAsia="ko-KR"/>
-        </w:rPr>
-        <w:tab/>
+          <w:lang w:val="vi-VN" w:eastAsia="ko-KR"/>
+        </w:rPr>
+        <w:t xml:space="preserve"> </w:t>
+      </w:r>
+      <w:r>
+        <w:rPr>
+          <w:lang w:val="vi-VN" w:eastAsia="ko-KR"/>
+        </w:rPr>
+        <w:t>{{ gioi_tinh }}</w:t>
       </w:r>
     </w:p>
     <w:p>
@@ -351,7 +369,19 @@
         <w:rPr>
           <w:lang w:val="vi-VN" w:eastAsia="ko-KR"/>
         </w:rPr>
-        <w:t xml:space="preserve">:……/……/…… </w:t>
+        <w:t>:</w:t>
+      </w:r>
+      <w:r>
+        <w:rPr>
+          <w:lang w:val="vi-VN" w:eastAsia="ko-KR"/>
+        </w:rPr>
+        <w:t xml:space="preserve"> </w:t>
+      </w:r>
+      <w:r>
+        <w:rPr>
+          <w:lang w:val="vi-VN" w:eastAsia="ko-KR"/>
+        </w:rPr>
+        <w:t>{{ ngay_sinh }}</w:t>
       </w:r>
     </w:p>
     <w:p>
@@ -387,7 +417,13 @@
         <w:rPr>
           <w:lang w:val="vi-VN" w:eastAsia="ko-KR"/>
         </w:rPr>
-        <w:tab/>
+        <w:t xml:space="preserve"> </w:t>
+      </w:r>
+      <w:r>
+        <w:rPr>
+          <w:lang w:val="vi-VN" w:eastAsia="ko-KR"/>
+        </w:rPr>
+        <w:t>{{ mssv }}</w:t>
       </w:r>
       <w:r>
         <w:rPr>
@@ -473,7 +509,13 @@
         <w:rPr>
           <w:lang w:val="vi-VN" w:eastAsia="ko-KR"/>
         </w:rPr>
-        <w:tab/>
+        <w:t xml:space="preserve"> </w:t>
+      </w:r>
+      <w:r>
+        <w:rPr>
+          <w:lang w:val="vi-VN" w:eastAsia="ko-KR"/>
+        </w:rPr>
+        <w:t>{{ chuyen_nganh }}</w:t>
       </w:r>
     </w:p>
     <w:p>
@@ -509,7 +551,13 @@
         <w:rPr>
           <w:lang w:val="vi-VN" w:eastAsia="ko-KR"/>
         </w:rPr>
-        <w:tab/>
+        <w:t xml:space="preserve"> </w:t>
+      </w:r>
+      <w:r>
+        <w:rPr>
+          <w:lang w:val="vi-VN" w:eastAsia="ko-KR"/>
+        </w:rPr>
+        <w:t>{{ khoa }}</w:t>
       </w:r>
     </w:p>
     <w:p>
@@ -546,6 +594,24 @@
         <w:rPr>
           <w:lang w:val="vi-VN" w:eastAsia="ko-KR"/>
         </w:rPr>
+        <w:t xml:space="preserve"> {{</w:t>
+      </w:r>
+      <w:r>
+        <w:rPr>
+          <w:lang w:val="vi-VN" w:eastAsia="ko-KR"/>
+        </w:rPr>
+        <w:t xml:space="preserve"> sdt </w:t>
+      </w:r>
+      <w:r>
+        <w:rPr>
+          <w:lang w:val="vi-VN" w:eastAsia="ko-KR"/>
+        </w:rPr>
+        <w:t>}}</w:t>
+      </w:r>
+      <w:r>
+        <w:rPr>
+          <w:lang w:val="vi-VN" w:eastAsia="ko-KR"/>
+        </w:rPr>
         <w:tab/>
       </w:r>
       <w:r>
@@ -571,7 +637,19 @@
         <w:rPr>
           <w:lang w:val="vi-VN" w:eastAsia="ko-KR"/>
         </w:rPr>
-        <w:tab/>
+        <w:t xml:space="preserve"> {{</w:t>
+      </w:r>
+      <w:r>
+        <w:rPr>
+          <w:lang w:val="vi-VN" w:eastAsia="ko-KR"/>
+        </w:rPr>
+        <w:t xml:space="preserve"> email </w:t>
+      </w:r>
+      <w:r>
+        <w:rPr>
+          <w:lang w:val="vi-VN" w:eastAsia="ko-KR"/>
+        </w:rPr>
+        <w:t>}}</w:t>
       </w:r>
     </w:p>
     <w:p>
@@ -614,6 +692,8 @@
       </w:pPr>
       <w:r>
         <w:rPr>
+          <w:b/>
+          <w:bCs/>
           <w:lang w:eastAsia="ko-KR"/>
         </w:rPr>
         <w:t>Ngày tham gia CLB</w:t>
@@ -627,26 +707,40 @@
       </w:r>
       <w:r>
         <w:rPr>
+          <w:b/>
+          <w:bCs/>
           <w:lang w:eastAsia="ko-KR"/>
         </w:rPr>
-        <w:t xml:space="preserve">: ……/……/…… </w:t>
+        <w:t>:</w:t>
+      </w:r>
+      <w:r>
+        <w:rPr>
+          <w:lang w:eastAsia="ko-KR"/>
+        </w:rPr>
+        <w:t xml:space="preserve"> </w:t>
       </w:r>
     </w:p>
     <w:p>
       <w:pPr>
         <w:ind w:firstLine="709"/>
         <w:rPr>
+          <w:b/>
+          <w:bCs/>
           <w:lang w:val="vi-VN" w:eastAsia="ko-KR"/>
         </w:rPr>
       </w:pPr>
       <w:r>
         <w:rPr>
+          <w:b/>
+          <w:bCs/>
           <w:lang w:eastAsia="ko-KR"/>
         </w:rPr>
         <w:t>Ban/Bộ phận</w:t>
       </w:r>
       <w:r>
         <w:rPr>
+          <w:b/>
+          <w:bCs/>
           <w:vertAlign w:val="superscript"/>
           <w:lang w:val="vi-VN" w:eastAsia="ko-KR"/>
         </w:rPr>
@@ -654,188 +748,292 @@
       </w:r>
       <w:r>
         <w:rPr>
+          <w:b/>
+          <w:bCs/>
           <w:lang w:eastAsia="ko-KR"/>
         </w:rPr>
         <w:t>:</w:t>
       </w:r>
     </w:p>
-    <w:p>
-      <w:pPr>
-        <w:ind w:firstLine="1276"/>
-        <w:rPr>
-          <w:lang w:val="vi-VN" w:eastAsia="ko-KR"/>
-        </w:rPr>
-      </w:pPr>
-      <w:sdt>
-        <w:sdtPr>
-          <w:rPr>
-            <w:lang w:val="vi-VN" w:eastAsia="ko-KR"/>
-          </w:rPr>
-          <w:id w:val="-346175269"/>
-          <w14:checkbox>
-            <w14:checked w14:val="0"/>
-            <w14:checkedState w14:val="2612" w14:font="MS Gothic"/>
-            <w14:uncheckedState w14:val="2610" w14:font="MS Gothic"/>
-          </w14:checkbox>
-        </w:sdtPr>
-        <w:sdtContent>
-          <w:r>
-            <w:rPr>
-              <w:rFonts w:ascii="MS Gothic" w:eastAsia="MS Gothic" w:hAnsi="MS Gothic" w:hint="eastAsia"/>
-              <w:lang w:val="vi-VN" w:eastAsia="ko-KR"/>
-            </w:rPr>
-            <w:t>☐</w:t>
-          </w:r>
-        </w:sdtContent>
-      </w:sdt>
-      <w:r>
-        <w:rPr>
-          <w:lang w:val="vi-VN" w:eastAsia="ko-KR"/>
-        </w:rPr>
-        <w:t xml:space="preserve"> </w:t>
-      </w:r>
-      <w:r>
-        <w:rPr>
-          <w:lang w:val="vi-VN" w:eastAsia="ko-KR"/>
-        </w:rPr>
-        <w:t>Ban Công nghệ</w:t>
-      </w:r>
-    </w:p>
-    <w:p>
-      <w:pPr>
-        <w:ind w:firstLine="1276"/>
-        <w:rPr>
-          <w:lang w:val="vi-VN" w:eastAsia="ko-KR"/>
-        </w:rPr>
-      </w:pPr>
-      <w:sdt>
-        <w:sdtPr>
-          <w:rPr>
-            <w:lang w:val="vi-VN" w:eastAsia="ko-KR"/>
-          </w:rPr>
-          <w:id w:val="-1263835253"/>
-          <w14:checkbox>
-            <w14:checked w14:val="0"/>
-            <w14:checkedState w14:val="2612" w14:font="MS Gothic"/>
-            <w14:uncheckedState w14:val="2610" w14:font="MS Gothic"/>
-          </w14:checkbox>
-        </w:sdtPr>
-        <w:sdtContent>
-          <w:r>
-            <w:rPr>
-              <w:rFonts w:ascii="MS Gothic" w:eastAsia="MS Gothic" w:hAnsi="MS Gothic" w:hint="eastAsia"/>
-              <w:lang w:val="vi-VN" w:eastAsia="ko-KR"/>
-            </w:rPr>
-            <w:t>☐</w:t>
-          </w:r>
-        </w:sdtContent>
-      </w:sdt>
-      <w:r>
-        <w:rPr>
-          <w:lang w:val="vi-VN" w:eastAsia="ko-KR"/>
-        </w:rPr>
-        <w:t xml:space="preserve"> </w:t>
-      </w:r>
-      <w:r>
-        <w:rPr>
-          <w:lang w:val="vi-VN" w:eastAsia="ko-KR"/>
-        </w:rPr>
-        <w:t>Ban Truyền thông</w:t>
-      </w:r>
-    </w:p>
-    <w:p>
-      <w:pPr>
-        <w:ind w:firstLine="1276"/>
-        <w:rPr>
-          <w:lang w:val="vi-VN" w:eastAsia="ko-KR"/>
-        </w:rPr>
-      </w:pPr>
-      <w:sdt>
-        <w:sdtPr>
-          <w:rPr>
-            <w:lang w:val="vi-VN" w:eastAsia="ko-KR"/>
-          </w:rPr>
-          <w:id w:val="-1861120133"/>
-          <w14:checkbox>
-            <w14:checked w14:val="0"/>
-            <w14:checkedState w14:val="2612" w14:font="MS Gothic"/>
-            <w14:uncheckedState w14:val="2610" w14:font="MS Gothic"/>
-          </w14:checkbox>
-        </w:sdtPr>
-        <w:sdtContent>
-          <w:r>
-            <w:rPr>
-              <w:rFonts w:ascii="MS Gothic" w:eastAsia="MS Gothic" w:hAnsi="MS Gothic" w:hint="eastAsia"/>
-              <w:lang w:val="vi-VN" w:eastAsia="ko-KR"/>
-            </w:rPr>
-            <w:t>☐</w:t>
-          </w:r>
-        </w:sdtContent>
-      </w:sdt>
-      <w:r>
-        <w:rPr>
-          <w:lang w:val="vi-VN" w:eastAsia="ko-KR"/>
-        </w:rPr>
-        <w:t xml:space="preserve"> </w:t>
-      </w:r>
-      <w:r>
-        <w:rPr>
-          <w:lang w:val="vi-VN" w:eastAsia="ko-KR"/>
-        </w:rPr>
-        <w:t>Ban Vận hành</w:t>
-      </w:r>
-    </w:p>
-    <w:p>
-      <w:pPr>
-        <w:tabs>
-          <w:tab w:val="left" w:leader="dot" w:pos="9072"/>
-        </w:tabs>
-        <w:ind w:firstLine="1276"/>
-        <w:rPr>
-          <w:lang w:val="vi-VN" w:eastAsia="ko-KR"/>
-        </w:rPr>
-      </w:pPr>
-      <w:sdt>
-        <w:sdtPr>
-          <w:rPr>
-            <w:lang w:val="vi-VN" w:eastAsia="ko-KR"/>
-          </w:rPr>
-          <w:id w:val="1034997259"/>
-          <w14:checkbox>
-            <w14:checked w14:val="0"/>
-            <w14:checkedState w14:val="2612" w14:font="MS Gothic"/>
-            <w14:uncheckedState w14:val="2610" w14:font="MS Gothic"/>
-          </w14:checkbox>
-        </w:sdtPr>
-        <w:sdtContent>
-          <w:r>
-            <w:rPr>
-              <w:rFonts w:ascii="MS Gothic" w:eastAsia="MS Gothic" w:hAnsi="MS Gothic" w:hint="eastAsia"/>
-              <w:lang w:val="vi-VN" w:eastAsia="ko-KR"/>
-            </w:rPr>
-            <w:t>☐</w:t>
-          </w:r>
-        </w:sdtContent>
-      </w:sdt>
-      <w:r>
-        <w:rPr>
-          <w:lang w:val="vi-VN" w:eastAsia="ko-KR"/>
-        </w:rPr>
-        <w:t xml:space="preserve"> </w:t>
-      </w:r>
-      <w:r>
-        <w:rPr>
-          <w:lang w:val="vi-VN" w:eastAsia="ko-KR"/>
-        </w:rPr>
-        <w:t>Khác:</w:t>
-      </w:r>
-      <w:r>
-        <w:rPr>
-          <w:lang w:val="vi-VN" w:eastAsia="ko-KR"/>
-        </w:rPr>
-        <w:tab/>
-      </w:r>
-    </w:p>
+    <w:tbl>
+      <w:tblPr>
+        <w:tblStyle w:val="TableGrid"/>
+        <w:tblW w:w="4320" w:type="pct"/>
+        <w:tblInd w:w="421" w:type="dxa"/>
+        <w:tblBorders>
+          <w:top w:val="none" w:sz="0" w:space="0" w:color="auto"/>
+          <w:left w:val="none" w:sz="0" w:space="0" w:color="auto"/>
+          <w:bottom w:val="none" w:sz="0" w:space="0" w:color="auto"/>
+          <w:right w:val="none" w:sz="0" w:space="0" w:color="auto"/>
+          <w:insideH w:val="none" w:sz="0" w:space="0" w:color="auto"/>
+          <w:insideV w:val="none" w:sz="0" w:space="0" w:color="auto"/>
+        </w:tblBorders>
+        <w:tblLook w:val="04A0" w:firstRow="1" w:lastRow="0" w:firstColumn="1" w:lastColumn="0" w:noHBand="0" w:noVBand="1"/>
+      </w:tblPr>
+      <w:tblGrid>
+        <w:gridCol w:w="1943"/>
+        <w:gridCol w:w="3044"/>
+        <w:gridCol w:w="1730"/>
+        <w:gridCol w:w="1365"/>
+      </w:tblGrid>
+      <w:tr>
+        <w:trPr>
+          <w:trHeight w:val="138"/>
+        </w:trPr>
+        <w:tc>
+          <w:tcPr>
+            <w:tcW w:w="525" w:type="pct"/>
+            <w:vAlign w:val="center"/>
+          </w:tcPr>
+          <w:p>
+            <w:pPr>
+              <w:jc w:val="right"/>
+              <w:rPr>
+                <w:lang w:eastAsia="ko-KR"/>
+              </w:rPr>
+            </w:pPr>
+            <w:r>
+              <w:rPr>
+                <w:lang w:eastAsia="ko-KR"/>
+              </w:rPr>
+              <w:t>{{ c_ban_cnh}}</w:t>
+            </w:r>
+          </w:p>
+        </w:tc>
+        <w:tc>
+          <w:tcPr>
+            <w:tcW w:w="2109" w:type="pct"/>
+            <w:vAlign w:val="center"/>
+          </w:tcPr>
+          <w:p>
+            <w:pPr>
+              <w:jc w:val="left"/>
+              <w:rPr>
+                <w:lang w:val="vi-VN" w:eastAsia="ko-KR"/>
+              </w:rPr>
+            </w:pPr>
+            <w:r>
+              <w:rPr>
+                <w:lang w:val="vi-VN" w:eastAsia="ko-KR"/>
+              </w:rPr>
+              <w:t>Ban Chủ nhiệm</w:t>
+            </w:r>
+          </w:p>
+        </w:tc>
+        <w:tc>
+          <w:tcPr>
+            <w:tcW w:w="1109" w:type="pct"/>
+            <w:vAlign w:val="center"/>
+          </w:tcPr>
+          <w:p>
+            <w:pPr>
+              <w:jc w:val="right"/>
+              <w:rPr>
+                <w:lang w:val="vi-VN" w:eastAsia="ko-KR"/>
+              </w:rPr>
+            </w:pPr>
+            <w:r>
+              <w:rPr>
+                <w:lang w:val="vi-VN" w:eastAsia="ko-KR"/>
+              </w:rPr>
+              <w:t>{{ c_ban_cn }}</w:t>
+            </w:r>
+          </w:p>
+        </w:tc>
+        <w:tc>
+          <w:tcPr>
+            <w:tcW w:w="1257" w:type="pct"/>
+            <w:vAlign w:val="center"/>
+          </w:tcPr>
+          <w:p>
+            <w:pPr>
+              <w:jc w:val="left"/>
+              <w:rPr>
+                <w:lang w:val="vi-VN" w:eastAsia="ko-KR"/>
+              </w:rPr>
+            </w:pPr>
+            <w:r>
+              <w:rPr>
+                <w:lang w:val="vi-VN" w:eastAsia="ko-KR"/>
+              </w:rPr>
+              <w:t>Ban Công nghệ</w:t>
+            </w:r>
+          </w:p>
+        </w:tc>
+      </w:tr>
+      <w:tr>
+        <w:tc>
+          <w:tcPr>
+            <w:tcW w:w="525" w:type="pct"/>
+            <w:vAlign w:val="center"/>
+          </w:tcPr>
+          <w:p>
+            <w:pPr>
+              <w:jc w:val="right"/>
+              <w:rPr>
+                <w:lang w:val="vi-VN" w:eastAsia="ko-KR"/>
+              </w:rPr>
+            </w:pPr>
+            <w:r>
+              <w:rPr>
+                <w:lang w:val="vi-VN" w:eastAsia="ko-KR"/>
+              </w:rPr>
+              <w:t>{{ c_ban_khac }}</w:t>
+            </w:r>
+          </w:p>
+        </w:tc>
+        <w:tc>
+          <w:tcPr>
+            <w:tcW w:w="2109" w:type="pct"/>
+            <w:vAlign w:val="center"/>
+          </w:tcPr>
+          <w:p>
+            <w:pPr>
+              <w:jc w:val="left"/>
+              <w:rPr>
+                <w:lang w:val="vi-VN" w:eastAsia="ko-KR"/>
+              </w:rPr>
+            </w:pPr>
+            <w:r>
+              <w:rPr>
+                <w:lang w:val="vi-VN" w:eastAsia="ko-KR"/>
+              </w:rPr>
+              <w:t>Khác:</w:t>
+            </w:r>
+            <w:r>
+              <w:rPr>
+                <w:lang w:val="vi-VN" w:eastAsia="ko-KR"/>
+              </w:rPr>
+              <w:tab/>
+            </w:r>
+            <w:r>
+              <w:rPr>
+                <w:lang w:val="vi-VN" w:eastAsia="ko-KR"/>
+              </w:rPr>
+              <w:t>{{ c_ban_khac</w:t>
+            </w:r>
+            <w:r>
+              <w:rPr>
+                <w:lang w:eastAsia="ko-KR"/>
+              </w:rPr>
+              <w:t>_text</w:t>
+            </w:r>
+            <w:r>
+              <w:rPr>
+                <w:lang w:val="vi-VN" w:eastAsia="ko-KR"/>
+              </w:rPr>
+              <w:t xml:space="preserve"> }}</w:t>
+            </w:r>
+          </w:p>
+        </w:tc>
+        <w:tc>
+          <w:tcPr>
+            <w:tcW w:w="1109" w:type="pct"/>
+            <w:vAlign w:val="center"/>
+          </w:tcPr>
+          <w:p>
+            <w:pPr>
+              <w:jc w:val="right"/>
+              <w:rPr>
+                <w:lang w:val="vi-VN" w:eastAsia="ko-KR"/>
+              </w:rPr>
+            </w:pPr>
+            <w:r>
+              <w:rPr>
+                <w:lang w:val="vi-VN" w:eastAsia="ko-KR"/>
+              </w:rPr>
+              <w:t>{{ c_ban_tt }}</w:t>
+            </w:r>
+          </w:p>
+        </w:tc>
+        <w:tc>
+          <w:tcPr>
+            <w:tcW w:w="1257" w:type="pct"/>
+            <w:vAlign w:val="center"/>
+          </w:tcPr>
+          <w:p>
+            <w:pPr>
+              <w:jc w:val="left"/>
+              <w:rPr>
+                <w:lang w:val="vi-VN" w:eastAsia="ko-KR"/>
+              </w:rPr>
+            </w:pPr>
+            <w:r>
+              <w:rPr>
+                <w:lang w:val="vi-VN" w:eastAsia="ko-KR"/>
+              </w:rPr>
+              <w:t>Ban Truyền thông</w:t>
+            </w:r>
+          </w:p>
+        </w:tc>
+      </w:tr>
+      <w:tr>
+        <w:tc>
+          <w:tcPr>
+            <w:tcW w:w="525" w:type="pct"/>
+          </w:tcPr>
+          <w:p>
+            <w:pPr>
+              <w:rPr>
+                <w:lang w:val="vi-VN" w:eastAsia="ko-KR"/>
+              </w:rPr>
+            </w:pPr>
+          </w:p>
+        </w:tc>
+        <w:tc>
+          <w:tcPr>
+            <w:tcW w:w="2109" w:type="pct"/>
+          </w:tcPr>
+          <w:p>
+            <w:pPr>
+              <w:rPr>
+                <w:lang w:val="vi-VN" w:eastAsia="ko-KR"/>
+              </w:rPr>
+            </w:pPr>
+          </w:p>
+        </w:tc>
+        <w:tc>
+          <w:tcPr>
+            <w:tcW w:w="1109" w:type="pct"/>
+            <w:vAlign w:val="center"/>
+          </w:tcPr>
+          <w:p>
+            <w:pPr>
+              <w:jc w:val="right"/>
+              <w:rPr>
+                <w:lang w:val="vi-VN" w:eastAsia="ko-KR"/>
+              </w:rPr>
+            </w:pPr>
+            <w:r>
+              <w:rPr>
+                <w:lang w:val="vi-VN" w:eastAsia="ko-KR"/>
+              </w:rPr>
+              <w:t>{{ c_ban_vh }}</w:t>
+            </w:r>
+          </w:p>
+        </w:tc>
+        <w:tc>
+          <w:tcPr>
+            <w:tcW w:w="1257" w:type="pct"/>
+            <w:vAlign w:val="center"/>
+          </w:tcPr>
+          <w:p>
+            <w:pPr>
+              <w:jc w:val="left"/>
+              <w:rPr>
+                <w:lang w:val="vi-VN" w:eastAsia="ko-KR"/>
+              </w:rPr>
+            </w:pPr>
+            <w:r>
+              <w:rPr>
+                <w:lang w:val="vi-VN" w:eastAsia="ko-KR"/>
+              </w:rPr>
+              <w:t>Ban Vận hành</w:t>
+            </w:r>
+          </w:p>
+        </w:tc>
+      </w:tr>
+    </w:tbl>
     <w:p>
       <w:pPr>
         <w:tabs>
@@ -848,15 +1046,41 @@
       </w:pPr>
       <w:r>
         <w:rPr>
+          <w:b/>
+          <w:bCs/>
           <w:lang w:val="vi-VN" w:eastAsia="ko-KR"/>
         </w:rPr>
-        <w:t>Vị trí/Chức vụ (nếu có):</w:t>
-      </w:r>
-      <w:r>
-        <w:rPr>
+        <w:t xml:space="preserve">Vị trí/Chức vụ </w:t>
+      </w:r>
+      <w:r>
+        <w:rPr>
+          <w:i/>
+          <w:iCs/>
           <w:lang w:val="vi-VN" w:eastAsia="ko-KR"/>
         </w:rPr>
-        <w:tab/>
+        <w:t>(nếu có)</w:t>
+      </w:r>
+      <w:r>
+        <w:rPr>
+          <w:b/>
+          <w:bCs/>
+          <w:lang w:val="vi-VN" w:eastAsia="ko-KR"/>
+        </w:rPr>
+        <w:t>:</w:t>
+      </w:r>
+      <w:r>
+        <w:rPr>
+          <w:b/>
+          <w:bCs/>
+          <w:lang w:val="vi-VN" w:eastAsia="ko-KR"/>
+        </w:rPr>
+        <w:t xml:space="preserve"> </w:t>
+      </w:r>
+      <w:r>
+        <w:rPr>
+          <w:lang w:val="vi-VN" w:eastAsia="ko-KR"/>
+        </w:rPr>
+        <w:t>{{ vi_tri }}</w:t>
       </w:r>
     </w:p>
     <w:p>
@@ -870,7 +1094,7 @@
         <w:t xml:space="preserve">ỹ năng &amp; </w:t>
       </w:r>
       <w:r>
-        <w:t>Đ</w:t>
+        <w:t>K</w:t>
       </w:r>
       <w:r>
         <w:t>inh nghiệm</w:t>
@@ -890,13 +1114,16 @@
         <w:tblLook w:val="04A0" w:firstRow="1" w:lastRow="0" w:firstColumn="1" w:lastColumn="0" w:noHBand="0" w:noVBand="1"/>
       </w:tblPr>
       <w:tblGrid>
-        <w:gridCol w:w="456"/>
-        <w:gridCol w:w="5604"/>
-        <w:gridCol w:w="910"/>
-        <w:gridCol w:w="1281"/>
-        <w:gridCol w:w="550"/>
+        <w:gridCol w:w="1130"/>
+        <w:gridCol w:w="4315"/>
+        <w:gridCol w:w="1211"/>
+        <w:gridCol w:w="1171"/>
+        <w:gridCol w:w="1238"/>
       </w:tblGrid>
       <w:tr>
+        <w:trPr>
+          <w:tblHeader/>
+        </w:trPr>
         <w:tc>
           <w:tcPr>
             <w:tcW w:w="0" w:type="auto"/>
@@ -964,6 +1191,9 @@
         </w:tc>
       </w:tr>
       <w:tr>
+        <w:trPr>
+          <w:tblHeader/>
+        </w:trPr>
         <w:tc>
           <w:tcPr>
             <w:tcW w:w="0" w:type="auto"/>
@@ -1078,31 +1308,16 @@
               <w:jc w:val="center"/>
               <w:rPr>
                 <w:rFonts w:cs="Times New Roman"/>
-                <w:lang w:val="vi-VN" w:eastAsia="ko-KR"/>
-              </w:rPr>
-            </w:pPr>
-            <w:sdt>
-              <w:sdtPr>
-                <w:rPr>
-                  <w:lang w:val="vi-VN" w:eastAsia="ko-KR"/>
-                </w:rPr>
-                <w:id w:val="-1508817679"/>
-                <w14:checkbox>
-                  <w14:checked w14:val="0"/>
-                  <w14:checkedState w14:val="2612" w14:font="MS Gothic"/>
-                  <w14:uncheckedState w14:val="2610" w14:font="MS Gothic"/>
-                </w14:checkbox>
-              </w:sdtPr>
-              <w:sdtContent>
-                <w:r>
-                  <w:rPr>
-                    <w:rFonts w:ascii="MS Gothic" w:eastAsia="MS Gothic" w:hAnsi="MS Gothic" w:hint="eastAsia"/>
-                    <w:lang w:val="vi-VN" w:eastAsia="ko-KR"/>
-                  </w:rPr>
-                  <w:t>☐</w:t>
-                </w:r>
-              </w:sdtContent>
-            </w:sdt>
+                <w:lang w:eastAsia="ko-KR"/>
+              </w:rPr>
+            </w:pPr>
+            <w:r>
+              <w:rPr>
+                <w:rFonts w:cs="Times New Roman"/>
+                <w:lang w:eastAsia="ko-KR"/>
+              </w:rPr>
+              <w:t>{{tk}}</w:t>
+            </w:r>
           </w:p>
         </w:tc>
         <w:tc>
@@ -1135,35 +1350,87 @@
           </w:tcPr>
           <w:p>
             <w:pPr>
+              <w:pStyle w:val="NoSpacing"/>
+              <w:rPr>
+                <w:lang w:eastAsia="ko-KR"/>
+              </w:rPr>
+            </w:pPr>
+            <w:r>
+              <w:t>{{ tk_cb }}</w:t>
+            </w:r>
+          </w:p>
+        </w:tc>
+        <w:tc>
+          <w:tcPr>
+            <w:tcW w:w="0" w:type="auto"/>
+            <w:vAlign w:val="center"/>
+          </w:tcPr>
+          <w:p>
+            <w:pPr>
+              <w:pStyle w:val="NoSpacing"/>
+              <w:rPr>
+                <w:lang w:eastAsia="ko-KR"/>
+              </w:rPr>
+            </w:pPr>
+            <w:r>
+              <w:t>{{ tk_tb }}</w:t>
+            </w:r>
+          </w:p>
+        </w:tc>
+        <w:tc>
+          <w:tcPr>
+            <w:tcW w:w="0" w:type="auto"/>
+            <w:vAlign w:val="center"/>
+          </w:tcPr>
+          <w:p>
+            <w:pPr>
+              <w:pStyle w:val="NoSpacing"/>
+              <w:rPr>
+                <w:lang w:eastAsia="ko-KR"/>
+              </w:rPr>
+            </w:pPr>
+            <w:r>
+              <w:t>{{ tk_tot }}</w:t>
+            </w:r>
+          </w:p>
+        </w:tc>
+      </w:tr>
+      <w:tr>
+        <w:tc>
+          <w:tcPr>
+            <w:tcW w:w="0" w:type="auto"/>
+            <w:vAlign w:val="center"/>
+          </w:tcPr>
+          <w:p>
+            <w:pPr>
               <w:spacing w:before="60" w:after="60"/>
               <w:jc w:val="center"/>
               <w:rPr>
                 <w:rFonts w:cs="Times New Roman"/>
+                <w:lang w:val="vi-VN" w:eastAsia="ko-KR"/>
+              </w:rPr>
+            </w:pPr>
+            <w:r>
+              <w:rPr>
+                <w:rFonts w:cs="Times New Roman"/>
                 <w:lang w:eastAsia="ko-KR"/>
               </w:rPr>
-            </w:pPr>
-            <w:sdt>
-              <w:sdtPr>
-                <w:rPr>
-                  <w:lang w:val="vi-VN" w:eastAsia="ko-KR"/>
-                </w:rPr>
-                <w:id w:val="-1029113255"/>
-                <w14:checkbox>
-                  <w14:checked w14:val="0"/>
-                  <w14:checkedState w14:val="2612" w14:font="MS Gothic"/>
-                  <w14:uncheckedState w14:val="2610" w14:font="MS Gothic"/>
-                </w14:checkbox>
-              </w:sdtPr>
-              <w:sdtContent>
-                <w:r>
-                  <w:rPr>
-                    <w:rFonts w:ascii="MS Gothic" w:eastAsia="MS Gothic" w:hAnsi="MS Gothic" w:hint="eastAsia"/>
-                    <w:lang w:val="vi-VN" w:eastAsia="ko-KR"/>
-                  </w:rPr>
-                  <w:t>☐</w:t>
-                </w:r>
-              </w:sdtContent>
-            </w:sdt>
+              <w:t>{{</w:t>
+            </w:r>
+            <w:r>
+              <w:rPr>
+                <w:rFonts w:cs="Times New Roman"/>
+                <w:lang w:eastAsia="ko-KR"/>
+              </w:rPr>
+              <w:t>qd</w:t>
+            </w:r>
+            <w:r>
+              <w:rPr>
+                <w:rFonts w:cs="Times New Roman"/>
+                <w:lang w:eastAsia="ko-KR"/>
+              </w:rPr>
+              <w:t>}}</w:t>
+            </w:r>
           </w:p>
         </w:tc>
         <w:tc>
@@ -1174,34 +1441,19 @@
           <w:p>
             <w:pPr>
               <w:spacing w:before="60" w:after="60"/>
-              <w:jc w:val="center"/>
+              <w:jc w:val="left"/>
+              <w:rPr>
+                <w:rFonts w:cs="Times New Roman"/>
+                <w:lang w:val="vi-VN" w:eastAsia="ko-KR"/>
+              </w:rPr>
+            </w:pPr>
+            <w:r>
               <w:rPr>
                 <w:rFonts w:cs="Times New Roman"/>
                 <w:lang w:eastAsia="ko-KR"/>
               </w:rPr>
-            </w:pPr>
-            <w:sdt>
-              <w:sdtPr>
-                <w:rPr>
-                  <w:lang w:val="vi-VN" w:eastAsia="ko-KR"/>
-                </w:rPr>
-                <w:id w:val="507802802"/>
-                <w14:checkbox>
-                  <w14:checked w14:val="0"/>
-                  <w14:checkedState w14:val="2612" w14:font="MS Gothic"/>
-                  <w14:uncheckedState w14:val="2610" w14:font="MS Gothic"/>
-                </w14:checkbox>
-              </w:sdtPr>
-              <w:sdtContent>
-                <w:r>
-                  <w:rPr>
-                    <w:rFonts w:ascii="MS Gothic" w:eastAsia="MS Gothic" w:hAnsi="MS Gothic" w:hint="eastAsia"/>
-                    <w:lang w:val="vi-VN" w:eastAsia="ko-KR"/>
-                  </w:rPr>
-                  <w:t>☐</w:t>
-                </w:r>
-              </w:sdtContent>
-            </w:sdt>
+              <w:t>Quay dựng video (Premiere, CapCut, After Effects, …)</w:t>
+            </w:r>
           </w:p>
         </w:tc>
         <w:tc>
@@ -1211,35 +1463,161 @@
           </w:tcPr>
           <w:p>
             <w:pPr>
+              <w:pStyle w:val="NoSpacing"/>
+              <w:rPr>
+                <w:lang w:eastAsia="ko-KR"/>
+              </w:rPr>
+            </w:pPr>
+            <w:r>
+              <w:t>{{ qd_cb }}</w:t>
+            </w:r>
+          </w:p>
+        </w:tc>
+        <w:tc>
+          <w:tcPr>
+            <w:tcW w:w="0" w:type="auto"/>
+            <w:vAlign w:val="center"/>
+          </w:tcPr>
+          <w:p>
+            <w:pPr>
+              <w:pStyle w:val="NoSpacing"/>
+              <w:rPr>
+                <w:lang w:eastAsia="ko-KR"/>
+              </w:rPr>
+            </w:pPr>
+            <w:r>
+              <w:t>{{ qd_tb }}</w:t>
+            </w:r>
+          </w:p>
+        </w:tc>
+        <w:tc>
+          <w:tcPr>
+            <w:tcW w:w="0" w:type="auto"/>
+            <w:vAlign w:val="center"/>
+          </w:tcPr>
+          <w:p>
+            <w:pPr>
+              <w:pStyle w:val="NoSpacing"/>
+              <w:rPr>
+                <w:lang w:eastAsia="ko-KR"/>
+              </w:rPr>
+            </w:pPr>
+            <w:r>
+              <w:t>{{ qd_tot }}</w:t>
+            </w:r>
+          </w:p>
+        </w:tc>
+      </w:tr>
+      <w:tr>
+        <w:tc>
+          <w:tcPr>
+            <w:tcW w:w="0" w:type="auto"/>
+            <w:vAlign w:val="center"/>
+          </w:tcPr>
+          <w:p>
+            <w:pPr>
               <w:spacing w:before="60" w:after="60"/>
               <w:jc w:val="center"/>
               <w:rPr>
                 <w:rFonts w:cs="Times New Roman"/>
+                <w:lang w:val="vi-VN" w:eastAsia="ko-KR"/>
+              </w:rPr>
+            </w:pPr>
+            <w:r>
+              <w:rPr>
+                <w:rFonts w:cs="Times New Roman"/>
                 <w:lang w:eastAsia="ko-KR"/>
               </w:rPr>
-            </w:pPr>
-            <w:sdt>
-              <w:sdtPr>
-                <w:rPr>
-                  <w:lang w:val="vi-VN" w:eastAsia="ko-KR"/>
-                </w:rPr>
-                <w:id w:val="-1995173654"/>
-                <w14:checkbox>
-                  <w14:checked w14:val="0"/>
-                  <w14:checkedState w14:val="2612" w14:font="MS Gothic"/>
-                  <w14:uncheckedState w14:val="2610" w14:font="MS Gothic"/>
-                </w14:checkbox>
-              </w:sdtPr>
-              <w:sdtContent>
-                <w:r>
-                  <w:rPr>
-                    <w:rFonts w:ascii="MS Gothic" w:eastAsia="MS Gothic" w:hAnsi="MS Gothic" w:hint="eastAsia"/>
-                    <w:lang w:val="vi-VN" w:eastAsia="ko-KR"/>
-                  </w:rPr>
-                  <w:t>☐</w:t>
-                </w:r>
-              </w:sdtContent>
-            </w:sdt>
+              <w:t>{{</w:t>
+            </w:r>
+            <w:r>
+              <w:rPr>
+                <w:rFonts w:cs="Times New Roman"/>
+                <w:lang w:eastAsia="ko-KR"/>
+              </w:rPr>
+              <w:t>ct</w:t>
+            </w:r>
+            <w:r>
+              <w:rPr>
+                <w:rFonts w:cs="Times New Roman"/>
+                <w:lang w:eastAsia="ko-KR"/>
+              </w:rPr>
+              <w:t>}}</w:t>
+            </w:r>
+          </w:p>
+        </w:tc>
+        <w:tc>
+          <w:tcPr>
+            <w:tcW w:w="0" w:type="auto"/>
+            <w:vAlign w:val="center"/>
+          </w:tcPr>
+          <w:p>
+            <w:pPr>
+              <w:spacing w:before="60" w:after="60"/>
+              <w:jc w:val="left"/>
+              <w:rPr>
+                <w:rFonts w:cs="Times New Roman"/>
+                <w:lang w:val="vi-VN" w:eastAsia="ko-KR"/>
+              </w:rPr>
+            </w:pPr>
+            <w:r>
+              <w:rPr>
+                <w:rFonts w:cs="Times New Roman"/>
+                <w:lang w:eastAsia="ko-KR"/>
+              </w:rPr>
+              <w:t>Viết Content / Copywriting</w:t>
+            </w:r>
+          </w:p>
+        </w:tc>
+        <w:tc>
+          <w:tcPr>
+            <w:tcW w:w="0" w:type="auto"/>
+            <w:vAlign w:val="center"/>
+          </w:tcPr>
+          <w:p>
+            <w:pPr>
+              <w:pStyle w:val="NoSpacing"/>
+              <w:rPr>
+                <w:lang w:eastAsia="ko-KR"/>
+              </w:rPr>
+            </w:pPr>
+            <w:r>
+              <w:t>{{ ct_cb }}</w:t>
+            </w:r>
+          </w:p>
+        </w:tc>
+        <w:tc>
+          <w:tcPr>
+            <w:tcW w:w="0" w:type="auto"/>
+            <w:vAlign w:val="center"/>
+          </w:tcPr>
+          <w:p>
+            <w:pPr>
+              <w:pStyle w:val="NoSpacing"/>
+              <w:rPr>
+                <w:lang w:eastAsia="ko-KR"/>
+              </w:rPr>
+            </w:pPr>
+            <w:r>
+              <w:t>{{ ct_tb }}</w:t>
+            </w:r>
+          </w:p>
+        </w:tc>
+        <w:tc>
+          <w:tcPr>
+            <w:tcW w:w="0" w:type="auto"/>
+            <w:vAlign w:val="center"/>
+          </w:tcPr>
+          <w:p>
+            <w:pPr>
+              <w:pStyle w:val="NoSpacing"/>
+              <w:rPr>
+                <w:lang w:eastAsia="ko-KR"/>
+              </w:rPr>
+            </w:pPr>
+            <w:r>
+              <w:t>{{ ct_tot }}</w:t>
+            </w:r>
           </w:p>
         </w:tc>
       </w:tr>
@@ -1247,7 +1625,6 @@
         <w:tc>
           <w:tcPr>
             <w:tcW w:w="0" w:type="auto"/>
-            <w:vAlign w:val="center"/>
           </w:tcPr>
           <w:p>
             <w:pPr>
@@ -1258,28 +1635,27 @@
                 <w:lang w:val="vi-VN" w:eastAsia="ko-KR"/>
               </w:rPr>
             </w:pPr>
-            <w:sdt>
-              <w:sdtPr>
-                <w:rPr>
-                  <w:lang w:val="vi-VN" w:eastAsia="ko-KR"/>
-                </w:rPr>
-                <w:id w:val="2049562217"/>
-                <w14:checkbox>
-                  <w14:checked w14:val="0"/>
-                  <w14:checkedState w14:val="2612" w14:font="MS Gothic"/>
-                  <w14:uncheckedState w14:val="2610" w14:font="MS Gothic"/>
-                </w14:checkbox>
-              </w:sdtPr>
-              <w:sdtContent>
-                <w:r>
-                  <w:rPr>
-                    <w:rFonts w:ascii="MS Gothic" w:eastAsia="MS Gothic" w:hAnsi="MS Gothic" w:hint="eastAsia"/>
-                    <w:lang w:val="vi-VN" w:eastAsia="ko-KR"/>
-                  </w:rPr>
-                  <w:t>☐</w:t>
-                </w:r>
-              </w:sdtContent>
-            </w:sdt>
+            <w:r>
+              <w:rPr>
+                <w:rFonts w:cs="Times New Roman"/>
+                <w:lang w:eastAsia="ko-KR"/>
+              </w:rPr>
+              <w:t>{{</w:t>
+            </w:r>
+            <w:r>
+              <w:rPr>
+                <w:rFonts w:cs="Times New Roman"/>
+                <w:lang w:eastAsia="ko-KR"/>
+              </w:rPr>
+              <w:t>fp</w:t>
+            </w:r>
+            <w:r>
+              <w:rPr>
+                <w:rFonts w:cs="Times New Roman"/>
+                <w:lang w:eastAsia="ko-KR"/>
+              </w:rPr>
+              <w:t>}}</w:t>
+            </w:r>
           </w:p>
         </w:tc>
         <w:tc>
@@ -1301,7 +1677,7 @@
                 <w:rFonts w:cs="Times New Roman"/>
                 <w:lang w:eastAsia="ko-KR"/>
               </w:rPr>
-              <w:t>Quay dựng video (Premiere, CapCut, After Effects, …)</w:t>
+              <w:t>Quản lý Fanpage / Social Media</w:t>
             </w:r>
           </w:p>
         </w:tc>
@@ -1312,35 +1688,86 @@
           </w:tcPr>
           <w:p>
             <w:pPr>
+              <w:pStyle w:val="NoSpacing"/>
+              <w:rPr>
+                <w:lang w:eastAsia="ko-KR"/>
+              </w:rPr>
+            </w:pPr>
+            <w:r>
+              <w:t>{{ fp_cb }}</w:t>
+            </w:r>
+          </w:p>
+        </w:tc>
+        <w:tc>
+          <w:tcPr>
+            <w:tcW w:w="0" w:type="auto"/>
+            <w:vAlign w:val="center"/>
+          </w:tcPr>
+          <w:p>
+            <w:pPr>
+              <w:pStyle w:val="NoSpacing"/>
+              <w:rPr>
+                <w:lang w:eastAsia="ko-KR"/>
+              </w:rPr>
+            </w:pPr>
+            <w:r>
+              <w:t>{{ fp_tb }}</w:t>
+            </w:r>
+          </w:p>
+        </w:tc>
+        <w:tc>
+          <w:tcPr>
+            <w:tcW w:w="0" w:type="auto"/>
+            <w:vAlign w:val="center"/>
+          </w:tcPr>
+          <w:p>
+            <w:pPr>
+              <w:pStyle w:val="NoSpacing"/>
+              <w:rPr>
+                <w:lang w:eastAsia="ko-KR"/>
+              </w:rPr>
+            </w:pPr>
+            <w:r>
+              <w:t>{{ fp_tot }}</w:t>
+            </w:r>
+          </w:p>
+        </w:tc>
+      </w:tr>
+      <w:tr>
+        <w:tc>
+          <w:tcPr>
+            <w:tcW w:w="0" w:type="auto"/>
+          </w:tcPr>
+          <w:p>
+            <w:pPr>
               <w:spacing w:before="60" w:after="60"/>
               <w:jc w:val="center"/>
               <w:rPr>
                 <w:rFonts w:cs="Times New Roman"/>
+                <w:lang w:val="vi-VN" w:eastAsia="ko-KR"/>
+              </w:rPr>
+            </w:pPr>
+            <w:r>
+              <w:rPr>
+                <w:rFonts w:cs="Times New Roman"/>
                 <w:lang w:eastAsia="ko-KR"/>
               </w:rPr>
-            </w:pPr>
-            <w:sdt>
-              <w:sdtPr>
-                <w:rPr>
-                  <w:lang w:val="vi-VN" w:eastAsia="ko-KR"/>
-                </w:rPr>
-                <w:id w:val="-1020859134"/>
-                <w14:checkbox>
-                  <w14:checked w14:val="0"/>
-                  <w14:checkedState w14:val="2612" w14:font="MS Gothic"/>
-                  <w14:uncheckedState w14:val="2610" w14:font="MS Gothic"/>
-                </w14:checkbox>
-              </w:sdtPr>
-              <w:sdtContent>
-                <w:r>
-                  <w:rPr>
-                    <w:rFonts w:ascii="MS Gothic" w:eastAsia="MS Gothic" w:hAnsi="MS Gothic" w:hint="eastAsia"/>
-                    <w:lang w:val="vi-VN" w:eastAsia="ko-KR"/>
-                  </w:rPr>
-                  <w:t>☐</w:t>
-                </w:r>
-              </w:sdtContent>
-            </w:sdt>
+              <w:t>{{</w:t>
+            </w:r>
+            <w:r>
+              <w:rPr>
+                <w:rFonts w:cs="Times New Roman"/>
+                <w:lang w:eastAsia="ko-KR"/>
+              </w:rPr>
+              <w:t>ca</w:t>
+            </w:r>
+            <w:r>
+              <w:rPr>
+                <w:rFonts w:cs="Times New Roman"/>
+                <w:lang w:eastAsia="ko-KR"/>
+              </w:rPr>
+              <w:t>}}</w:t>
+            </w:r>
           </w:p>
         </w:tc>
         <w:tc>
@@ -1351,34 +1778,19 @@
           <w:p>
             <w:pPr>
               <w:spacing w:before="60" w:after="60"/>
-              <w:jc w:val="center"/>
+              <w:jc w:val="left"/>
+              <w:rPr>
+                <w:rFonts w:cs="Times New Roman"/>
+                <w:lang w:val="vi-VN" w:eastAsia="ko-KR"/>
+              </w:rPr>
+            </w:pPr>
+            <w:r>
               <w:rPr>
                 <w:rFonts w:cs="Times New Roman"/>
                 <w:lang w:eastAsia="ko-KR"/>
               </w:rPr>
-            </w:pPr>
-            <w:sdt>
-              <w:sdtPr>
-                <w:rPr>
-                  <w:lang w:val="vi-VN" w:eastAsia="ko-KR"/>
-                </w:rPr>
-                <w:id w:val="-1754661562"/>
-                <w14:checkbox>
-                  <w14:checked w14:val="0"/>
-                  <w14:checkedState w14:val="2612" w14:font="MS Gothic"/>
-                  <w14:uncheckedState w14:val="2610" w14:font="MS Gothic"/>
-                </w14:checkbox>
-              </w:sdtPr>
-              <w:sdtContent>
-                <w:r>
-                  <w:rPr>
-                    <w:rFonts w:ascii="MS Gothic" w:eastAsia="MS Gothic" w:hAnsi="MS Gothic" w:hint="eastAsia"/>
-                    <w:lang w:val="vi-VN" w:eastAsia="ko-KR"/>
-                  </w:rPr>
-                  <w:t>☐</w:t>
-                </w:r>
-              </w:sdtContent>
-            </w:sdt>
+              <w:t>Chụp ảnh</w:t>
+            </w:r>
           </w:p>
         </w:tc>
         <w:tc>
@@ -1388,35 +1800,161 @@
           </w:tcPr>
           <w:p>
             <w:pPr>
+              <w:pStyle w:val="NoSpacing"/>
+              <w:rPr>
+                <w:lang w:eastAsia="ko-KR"/>
+              </w:rPr>
+            </w:pPr>
+            <w:r>
+              <w:t>{{ ca_cb }}</w:t>
+            </w:r>
+          </w:p>
+        </w:tc>
+        <w:tc>
+          <w:tcPr>
+            <w:tcW w:w="0" w:type="auto"/>
+            <w:vAlign w:val="center"/>
+          </w:tcPr>
+          <w:p>
+            <w:pPr>
+              <w:pStyle w:val="NoSpacing"/>
+              <w:rPr>
+                <w:lang w:eastAsia="ko-KR"/>
+              </w:rPr>
+            </w:pPr>
+            <w:r>
+              <w:t>{{ ca_tb }}</w:t>
+            </w:r>
+          </w:p>
+        </w:tc>
+        <w:tc>
+          <w:tcPr>
+            <w:tcW w:w="0" w:type="auto"/>
+            <w:vAlign w:val="center"/>
+          </w:tcPr>
+          <w:p>
+            <w:pPr>
+              <w:pStyle w:val="NoSpacing"/>
+              <w:rPr>
+                <w:lang w:eastAsia="ko-KR"/>
+              </w:rPr>
+            </w:pPr>
+            <w:r>
+              <w:t>{{ ca_tot }}</w:t>
+            </w:r>
+          </w:p>
+        </w:tc>
+      </w:tr>
+      <w:tr>
+        <w:tc>
+          <w:tcPr>
+            <w:tcW w:w="0" w:type="auto"/>
+          </w:tcPr>
+          <w:p>
+            <w:pPr>
               <w:spacing w:before="60" w:after="60"/>
               <w:jc w:val="center"/>
               <w:rPr>
                 <w:rFonts w:cs="Times New Roman"/>
+                <w:lang w:val="vi-VN" w:eastAsia="ko-KR"/>
+              </w:rPr>
+            </w:pPr>
+            <w:r>
+              <w:rPr>
+                <w:rFonts w:cs="Times New Roman"/>
                 <w:lang w:eastAsia="ko-KR"/>
               </w:rPr>
-            </w:pPr>
-            <w:sdt>
-              <w:sdtPr>
-                <w:rPr>
-                  <w:lang w:val="vi-VN" w:eastAsia="ko-KR"/>
-                </w:rPr>
-                <w:id w:val="1183699845"/>
-                <w14:checkbox>
-                  <w14:checked w14:val="0"/>
-                  <w14:checkedState w14:val="2612" w14:font="MS Gothic"/>
-                  <w14:uncheckedState w14:val="2610" w14:font="MS Gothic"/>
-                </w14:checkbox>
-              </w:sdtPr>
-              <w:sdtContent>
-                <w:r>
-                  <w:rPr>
-                    <w:rFonts w:ascii="MS Gothic" w:eastAsia="MS Gothic" w:hAnsi="MS Gothic" w:hint="eastAsia"/>
-                    <w:lang w:val="vi-VN" w:eastAsia="ko-KR"/>
-                  </w:rPr>
-                  <w:t>☐</w:t>
-                </w:r>
-              </w:sdtContent>
-            </w:sdt>
+              <w:lastRenderedPageBreak/>
+              <w:t>{{</w:t>
+            </w:r>
+            <w:r>
+              <w:rPr>
+                <w:rFonts w:cs="Times New Roman"/>
+                <w:lang w:eastAsia="ko-KR"/>
+              </w:rPr>
+              <w:t>lt</w:t>
+            </w:r>
+            <w:r>
+              <w:rPr>
+                <w:rFonts w:cs="Times New Roman"/>
+                <w:lang w:eastAsia="ko-KR"/>
+              </w:rPr>
+              <w:t>}}</w:t>
+            </w:r>
+          </w:p>
+        </w:tc>
+        <w:tc>
+          <w:tcPr>
+            <w:tcW w:w="0" w:type="auto"/>
+            <w:vAlign w:val="center"/>
+          </w:tcPr>
+          <w:p>
+            <w:pPr>
+              <w:spacing w:before="60" w:after="60"/>
+              <w:jc w:val="left"/>
+              <w:rPr>
+                <w:rFonts w:cs="Times New Roman"/>
+                <w:lang w:val="vi-VN" w:eastAsia="ko-KR"/>
+              </w:rPr>
+            </w:pPr>
+            <w:r>
+              <w:rPr>
+                <w:rFonts w:cs="Times New Roman"/>
+                <w:lang w:eastAsia="ko-KR"/>
+              </w:rPr>
+              <w:t>Lập trình / Website</w:t>
+            </w:r>
+          </w:p>
+        </w:tc>
+        <w:tc>
+          <w:tcPr>
+            <w:tcW w:w="0" w:type="auto"/>
+            <w:vAlign w:val="center"/>
+          </w:tcPr>
+          <w:p>
+            <w:pPr>
+              <w:pStyle w:val="NoSpacing"/>
+              <w:rPr>
+                <w:lang w:eastAsia="ko-KR"/>
+              </w:rPr>
+            </w:pPr>
+            <w:r>
+              <w:t>{{ lt_cb }}</w:t>
+            </w:r>
+          </w:p>
+        </w:tc>
+        <w:tc>
+          <w:tcPr>
+            <w:tcW w:w="0" w:type="auto"/>
+            <w:vAlign w:val="center"/>
+          </w:tcPr>
+          <w:p>
+            <w:pPr>
+              <w:pStyle w:val="NoSpacing"/>
+              <w:rPr>
+                <w:lang w:eastAsia="ko-KR"/>
+              </w:rPr>
+            </w:pPr>
+            <w:r>
+              <w:t>{{ lt_tb }}</w:t>
+            </w:r>
+          </w:p>
+        </w:tc>
+        <w:tc>
+          <w:tcPr>
+            <w:tcW w:w="0" w:type="auto"/>
+            <w:vAlign w:val="center"/>
+          </w:tcPr>
+          <w:p>
+            <w:pPr>
+              <w:pStyle w:val="NoSpacing"/>
+              <w:rPr>
+                <w:lang w:eastAsia="ko-KR"/>
+              </w:rPr>
+            </w:pPr>
+            <w:r>
+              <w:t>{{ lt_tot }}</w:t>
+            </w:r>
           </w:p>
         </w:tc>
       </w:tr>
@@ -1424,7 +1962,6 @@
         <w:tc>
           <w:tcPr>
             <w:tcW w:w="0" w:type="auto"/>
-            <w:vAlign w:val="center"/>
           </w:tcPr>
           <w:p>
             <w:pPr>
@@ -1435,28 +1972,27 @@
                 <w:lang w:val="vi-VN" w:eastAsia="ko-KR"/>
               </w:rPr>
             </w:pPr>
-            <w:sdt>
-              <w:sdtPr>
-                <w:rPr>
-                  <w:lang w:val="vi-VN" w:eastAsia="ko-KR"/>
-                </w:rPr>
-                <w:id w:val="-155926110"/>
-                <w14:checkbox>
-                  <w14:checked w14:val="0"/>
-                  <w14:checkedState w14:val="2612" w14:font="MS Gothic"/>
-                  <w14:uncheckedState w14:val="2610" w14:font="MS Gothic"/>
-                </w14:checkbox>
-              </w:sdtPr>
-              <w:sdtContent>
-                <w:r>
-                  <w:rPr>
-                    <w:rFonts w:ascii="MS Gothic" w:eastAsia="MS Gothic" w:hAnsi="MS Gothic" w:hint="eastAsia"/>
-                    <w:lang w:val="vi-VN" w:eastAsia="ko-KR"/>
-                  </w:rPr>
-                  <w:t>☐</w:t>
-                </w:r>
-              </w:sdtContent>
-            </w:sdt>
+            <w:r>
+              <w:rPr>
+                <w:rFonts w:cs="Times New Roman"/>
+                <w:lang w:eastAsia="ko-KR"/>
+              </w:rPr>
+              <w:t>{{</w:t>
+            </w:r>
+            <w:r>
+              <w:rPr>
+                <w:rFonts w:cs="Times New Roman"/>
+                <w:lang w:eastAsia="ko-KR"/>
+              </w:rPr>
+              <w:t>mc</w:t>
+            </w:r>
+            <w:r>
+              <w:rPr>
+                <w:rFonts w:cs="Times New Roman"/>
+                <w:lang w:eastAsia="ko-KR"/>
+              </w:rPr>
+              <w:t>}}</w:t>
+            </w:r>
           </w:p>
         </w:tc>
         <w:tc>
@@ -1476,9 +2012,9 @@
             <w:r>
               <w:rPr>
                 <w:rFonts w:cs="Times New Roman"/>
-                <w:lang w:eastAsia="ko-KR"/>
-              </w:rPr>
-              <w:t>Viết Content / Copywriting</w:t>
+                <w:lang w:val="vi-VN" w:eastAsia="ko-KR"/>
+              </w:rPr>
+              <w:t>MC / Tổ chức sự kiện</w:t>
             </w:r>
           </w:p>
         </w:tc>
@@ -1489,859 +2025,86 @@
           </w:tcPr>
           <w:p>
             <w:pPr>
-              <w:spacing w:before="60" w:after="60"/>
+              <w:pStyle w:val="NoSpacing"/>
+              <w:rPr>
+                <w:lang w:val="vi-VN" w:eastAsia="ko-KR"/>
+              </w:rPr>
+            </w:pPr>
+            <w:r>
+              <w:t>{{ mc_cb }}</w:t>
+            </w:r>
+          </w:p>
+        </w:tc>
+        <w:tc>
+          <w:tcPr>
+            <w:tcW w:w="0" w:type="auto"/>
+            <w:vAlign w:val="center"/>
+          </w:tcPr>
+          <w:p>
+            <w:pPr>
+              <w:pStyle w:val="NoSpacing"/>
+              <w:rPr>
+                <w:lang w:val="vi-VN" w:eastAsia="ko-KR"/>
+              </w:rPr>
+            </w:pPr>
+            <w:r>
+              <w:t>{{ mc_tb }}</w:t>
+            </w:r>
+          </w:p>
+        </w:tc>
+        <w:tc>
+          <w:tcPr>
+            <w:tcW w:w="0" w:type="auto"/>
+            <w:vAlign w:val="center"/>
+          </w:tcPr>
+          <w:p>
+            <w:pPr>
+              <w:pStyle w:val="NoSpacing"/>
+              <w:rPr>
+                <w:lang w:val="vi-VN" w:eastAsia="ko-KR"/>
+              </w:rPr>
+            </w:pPr>
+            <w:r>
+              <w:t>{{ mc_tot }}</w:t>
+            </w:r>
+          </w:p>
+        </w:tc>
+      </w:tr>
+      <w:tr>
+        <w:tc>
+          <w:tcPr>
+            <w:tcW w:w="0" w:type="auto"/>
+          </w:tcPr>
+          <w:p>
+            <w:pPr>
+              <w:spacing w:before="120"/>
               <w:jc w:val="center"/>
+              <w:rPr>
+                <w:rFonts w:cs="Times New Roman"/>
+                <w:lang w:val="vi-VN" w:eastAsia="ko-KR"/>
+              </w:rPr>
+            </w:pPr>
+            <w:r>
               <w:rPr>
                 <w:rFonts w:cs="Times New Roman"/>
                 <w:lang w:eastAsia="ko-KR"/>
               </w:rPr>
-            </w:pPr>
-            <w:sdt>
-              <w:sdtPr>
-                <w:rPr>
-                  <w:lang w:val="vi-VN" w:eastAsia="ko-KR"/>
-                </w:rPr>
-                <w:id w:val="-2106952930"/>
-                <w14:checkbox>
-                  <w14:checked w14:val="0"/>
-                  <w14:checkedState w14:val="2612" w14:font="MS Gothic"/>
-                  <w14:uncheckedState w14:val="2610" w14:font="MS Gothic"/>
-                </w14:checkbox>
-              </w:sdtPr>
-              <w:sdtContent>
-                <w:r>
-                  <w:rPr>
-                    <w:rFonts w:ascii="MS Gothic" w:eastAsia="MS Gothic" w:hAnsi="MS Gothic" w:hint="eastAsia"/>
-                    <w:lang w:val="vi-VN" w:eastAsia="ko-KR"/>
-                  </w:rPr>
-                  <w:t>☐</w:t>
-                </w:r>
-              </w:sdtContent>
-            </w:sdt>
-          </w:p>
-        </w:tc>
-        <w:tc>
-          <w:tcPr>
-            <w:tcW w:w="0" w:type="auto"/>
-            <w:vAlign w:val="center"/>
-          </w:tcPr>
-          <w:p>
-            <w:pPr>
-              <w:spacing w:before="60" w:after="60"/>
-              <w:jc w:val="center"/>
+              <w:t>{{</w:t>
+            </w:r>
+            <w:r>
               <w:rPr>
                 <w:rFonts w:cs="Times New Roman"/>
                 <w:lang w:eastAsia="ko-KR"/>
               </w:rPr>
-            </w:pPr>
-            <w:sdt>
-              <w:sdtPr>
-                <w:rPr>
-                  <w:lang w:val="vi-VN" w:eastAsia="ko-KR"/>
-                </w:rPr>
-                <w:id w:val="229054856"/>
-                <w14:checkbox>
-                  <w14:checked w14:val="0"/>
-                  <w14:checkedState w14:val="2612" w14:font="MS Gothic"/>
-                  <w14:uncheckedState w14:val="2610" w14:font="MS Gothic"/>
-                </w14:checkbox>
-              </w:sdtPr>
-              <w:sdtContent>
-                <w:r>
-                  <w:rPr>
-                    <w:rFonts w:ascii="MS Gothic" w:eastAsia="MS Gothic" w:hAnsi="MS Gothic" w:hint="eastAsia"/>
-                    <w:lang w:val="vi-VN" w:eastAsia="ko-KR"/>
-                  </w:rPr>
-                  <w:t>☐</w:t>
-                </w:r>
-              </w:sdtContent>
-            </w:sdt>
-          </w:p>
-        </w:tc>
-        <w:tc>
-          <w:tcPr>
-            <w:tcW w:w="0" w:type="auto"/>
-            <w:vAlign w:val="center"/>
-          </w:tcPr>
-          <w:p>
-            <w:pPr>
-              <w:spacing w:before="60" w:after="60"/>
-              <w:jc w:val="center"/>
+              <w:t>khac</w:t>
+            </w:r>
+            <w:r>
               <w:rPr>
                 <w:rFonts w:cs="Times New Roman"/>
                 <w:lang w:eastAsia="ko-KR"/>
               </w:rPr>
-            </w:pPr>
-            <w:sdt>
-              <w:sdtPr>
-                <w:rPr>
-                  <w:lang w:val="vi-VN" w:eastAsia="ko-KR"/>
-                </w:rPr>
-                <w:id w:val="-2096076506"/>
-                <w14:checkbox>
-                  <w14:checked w14:val="0"/>
-                  <w14:checkedState w14:val="2612" w14:font="MS Gothic"/>
-                  <w14:uncheckedState w14:val="2610" w14:font="MS Gothic"/>
-                </w14:checkbox>
-              </w:sdtPr>
-              <w:sdtContent>
-                <w:r>
-                  <w:rPr>
-                    <w:rFonts w:ascii="MS Gothic" w:eastAsia="MS Gothic" w:hAnsi="MS Gothic" w:hint="eastAsia"/>
-                    <w:lang w:val="vi-VN" w:eastAsia="ko-KR"/>
-                  </w:rPr>
-                  <w:t>☐</w:t>
-                </w:r>
-              </w:sdtContent>
-            </w:sdt>
-          </w:p>
-        </w:tc>
-      </w:tr>
-      <w:tr>
-        <w:tc>
-          <w:tcPr>
-            <w:tcW w:w="0" w:type="auto"/>
-            <w:vAlign w:val="center"/>
-          </w:tcPr>
-          <w:p>
-            <w:pPr>
-              <w:spacing w:before="60" w:after="60"/>
-              <w:jc w:val="center"/>
-              <w:rPr>
-                <w:rFonts w:cs="Times New Roman"/>
-                <w:lang w:val="vi-VN" w:eastAsia="ko-KR"/>
-              </w:rPr>
-            </w:pPr>
-            <w:sdt>
-              <w:sdtPr>
-                <w:rPr>
-                  <w:lang w:val="vi-VN" w:eastAsia="ko-KR"/>
-                </w:rPr>
-                <w:id w:val="-498040749"/>
-                <w14:checkbox>
-                  <w14:checked w14:val="0"/>
-                  <w14:checkedState w14:val="2612" w14:font="MS Gothic"/>
-                  <w14:uncheckedState w14:val="2610" w14:font="MS Gothic"/>
-                </w14:checkbox>
-              </w:sdtPr>
-              <w:sdtContent>
-                <w:r>
-                  <w:rPr>
-                    <w:rFonts w:ascii="MS Gothic" w:eastAsia="MS Gothic" w:hAnsi="MS Gothic" w:hint="eastAsia"/>
-                    <w:lang w:val="vi-VN" w:eastAsia="ko-KR"/>
-                  </w:rPr>
-                  <w:t>☐</w:t>
-                </w:r>
-              </w:sdtContent>
-            </w:sdt>
-          </w:p>
-        </w:tc>
-        <w:tc>
-          <w:tcPr>
-            <w:tcW w:w="0" w:type="auto"/>
-            <w:vAlign w:val="center"/>
-          </w:tcPr>
-          <w:p>
-            <w:pPr>
-              <w:spacing w:before="60" w:after="60"/>
-              <w:jc w:val="left"/>
-              <w:rPr>
-                <w:rFonts w:cs="Times New Roman"/>
-                <w:lang w:val="vi-VN" w:eastAsia="ko-KR"/>
-              </w:rPr>
-            </w:pPr>
-            <w:r>
-              <w:rPr>
-                <w:rFonts w:cs="Times New Roman"/>
-                <w:lang w:eastAsia="ko-KR"/>
-              </w:rPr>
-              <w:t>Quản lý Fanpage / Social Media</w:t>
-            </w:r>
-          </w:p>
-        </w:tc>
-        <w:tc>
-          <w:tcPr>
-            <w:tcW w:w="0" w:type="auto"/>
-            <w:vAlign w:val="center"/>
-          </w:tcPr>
-          <w:p>
-            <w:pPr>
-              <w:spacing w:before="60" w:after="60"/>
-              <w:jc w:val="center"/>
-              <w:rPr>
-                <w:rFonts w:cs="Times New Roman"/>
-                <w:lang w:eastAsia="ko-KR"/>
-              </w:rPr>
-            </w:pPr>
-            <w:sdt>
-              <w:sdtPr>
-                <w:rPr>
-                  <w:lang w:val="vi-VN" w:eastAsia="ko-KR"/>
-                </w:rPr>
-                <w:id w:val="441194123"/>
-                <w14:checkbox>
-                  <w14:checked w14:val="0"/>
-                  <w14:checkedState w14:val="2612" w14:font="MS Gothic"/>
-                  <w14:uncheckedState w14:val="2610" w14:font="MS Gothic"/>
-                </w14:checkbox>
-              </w:sdtPr>
-              <w:sdtContent>
-                <w:r>
-                  <w:rPr>
-                    <w:rFonts w:ascii="MS Gothic" w:eastAsia="MS Gothic" w:hAnsi="MS Gothic" w:hint="eastAsia"/>
-                    <w:lang w:val="vi-VN" w:eastAsia="ko-KR"/>
-                  </w:rPr>
-                  <w:t>☐</w:t>
-                </w:r>
-              </w:sdtContent>
-            </w:sdt>
-          </w:p>
-        </w:tc>
-        <w:tc>
-          <w:tcPr>
-            <w:tcW w:w="0" w:type="auto"/>
-            <w:vAlign w:val="center"/>
-          </w:tcPr>
-          <w:p>
-            <w:pPr>
-              <w:spacing w:before="60" w:after="60"/>
-              <w:jc w:val="center"/>
-              <w:rPr>
-                <w:rFonts w:cs="Times New Roman"/>
-                <w:lang w:eastAsia="ko-KR"/>
-              </w:rPr>
-            </w:pPr>
-            <w:sdt>
-              <w:sdtPr>
-                <w:rPr>
-                  <w:lang w:val="vi-VN" w:eastAsia="ko-KR"/>
-                </w:rPr>
-                <w:id w:val="-1918933455"/>
-                <w14:checkbox>
-                  <w14:checked w14:val="0"/>
-                  <w14:checkedState w14:val="2612" w14:font="MS Gothic"/>
-                  <w14:uncheckedState w14:val="2610" w14:font="MS Gothic"/>
-                </w14:checkbox>
-              </w:sdtPr>
-              <w:sdtContent>
-                <w:r>
-                  <w:rPr>
-                    <w:rFonts w:ascii="MS Gothic" w:eastAsia="MS Gothic" w:hAnsi="MS Gothic" w:hint="eastAsia"/>
-                    <w:lang w:val="vi-VN" w:eastAsia="ko-KR"/>
-                  </w:rPr>
-                  <w:t>☐</w:t>
-                </w:r>
-              </w:sdtContent>
-            </w:sdt>
-          </w:p>
-        </w:tc>
-        <w:tc>
-          <w:tcPr>
-            <w:tcW w:w="0" w:type="auto"/>
-            <w:vAlign w:val="center"/>
-          </w:tcPr>
-          <w:p>
-            <w:pPr>
-              <w:spacing w:before="60" w:after="60"/>
-              <w:jc w:val="center"/>
-              <w:rPr>
-                <w:rFonts w:cs="Times New Roman"/>
-                <w:lang w:eastAsia="ko-KR"/>
-              </w:rPr>
-            </w:pPr>
-            <w:sdt>
-              <w:sdtPr>
-                <w:rPr>
-                  <w:lang w:val="vi-VN" w:eastAsia="ko-KR"/>
-                </w:rPr>
-                <w:id w:val="-835299265"/>
-                <w14:checkbox>
-                  <w14:checked w14:val="0"/>
-                  <w14:checkedState w14:val="2612" w14:font="MS Gothic"/>
-                  <w14:uncheckedState w14:val="2610" w14:font="MS Gothic"/>
-                </w14:checkbox>
-              </w:sdtPr>
-              <w:sdtContent>
-                <w:r>
-                  <w:rPr>
-                    <w:rFonts w:ascii="MS Gothic" w:eastAsia="MS Gothic" w:hAnsi="MS Gothic" w:hint="eastAsia"/>
-                    <w:lang w:val="vi-VN" w:eastAsia="ko-KR"/>
-                  </w:rPr>
-                  <w:t>☐</w:t>
-                </w:r>
-              </w:sdtContent>
-            </w:sdt>
-          </w:p>
-        </w:tc>
-      </w:tr>
-      <w:tr>
-        <w:tc>
-          <w:tcPr>
-            <w:tcW w:w="0" w:type="auto"/>
-            <w:vAlign w:val="center"/>
-          </w:tcPr>
-          <w:p>
-            <w:pPr>
-              <w:spacing w:before="60" w:after="60"/>
-              <w:jc w:val="center"/>
-              <w:rPr>
-                <w:rFonts w:cs="Times New Roman"/>
-                <w:lang w:val="vi-VN" w:eastAsia="ko-KR"/>
-              </w:rPr>
-            </w:pPr>
-            <w:sdt>
-              <w:sdtPr>
-                <w:rPr>
-                  <w:lang w:val="vi-VN" w:eastAsia="ko-KR"/>
-                </w:rPr>
-                <w:id w:val="1504550046"/>
-                <w14:checkbox>
-                  <w14:checked w14:val="0"/>
-                  <w14:checkedState w14:val="2612" w14:font="MS Gothic"/>
-                  <w14:uncheckedState w14:val="2610" w14:font="MS Gothic"/>
-                </w14:checkbox>
-              </w:sdtPr>
-              <w:sdtContent>
-                <w:r>
-                  <w:rPr>
-                    <w:rFonts w:ascii="MS Gothic" w:eastAsia="MS Gothic" w:hAnsi="MS Gothic" w:hint="eastAsia"/>
-                    <w:lang w:val="vi-VN" w:eastAsia="ko-KR"/>
-                  </w:rPr>
-                  <w:t>☐</w:t>
-                </w:r>
-              </w:sdtContent>
-            </w:sdt>
-          </w:p>
-        </w:tc>
-        <w:tc>
-          <w:tcPr>
-            <w:tcW w:w="0" w:type="auto"/>
-            <w:vAlign w:val="center"/>
-          </w:tcPr>
-          <w:p>
-            <w:pPr>
-              <w:spacing w:before="60" w:after="60"/>
-              <w:jc w:val="left"/>
-              <w:rPr>
-                <w:rFonts w:cs="Times New Roman"/>
-                <w:lang w:val="vi-VN" w:eastAsia="ko-KR"/>
-              </w:rPr>
-            </w:pPr>
-            <w:r>
-              <w:rPr>
-                <w:rFonts w:cs="Times New Roman"/>
-                <w:lang w:eastAsia="ko-KR"/>
-              </w:rPr>
-              <w:t>Chụp ảnh</w:t>
-            </w:r>
-          </w:p>
-        </w:tc>
-        <w:tc>
-          <w:tcPr>
-            <w:tcW w:w="0" w:type="auto"/>
-            <w:vAlign w:val="center"/>
-          </w:tcPr>
-          <w:p>
-            <w:pPr>
-              <w:spacing w:before="60" w:after="60"/>
-              <w:jc w:val="center"/>
-              <w:rPr>
-                <w:rFonts w:cs="Times New Roman"/>
-                <w:lang w:eastAsia="ko-KR"/>
-              </w:rPr>
-            </w:pPr>
-            <w:sdt>
-              <w:sdtPr>
-                <w:rPr>
-                  <w:lang w:val="vi-VN" w:eastAsia="ko-KR"/>
-                </w:rPr>
-                <w:id w:val="-686516925"/>
-                <w14:checkbox>
-                  <w14:checked w14:val="0"/>
-                  <w14:checkedState w14:val="2612" w14:font="MS Gothic"/>
-                  <w14:uncheckedState w14:val="2610" w14:font="MS Gothic"/>
-                </w14:checkbox>
-              </w:sdtPr>
-              <w:sdtContent>
-                <w:r>
-                  <w:rPr>
-                    <w:rFonts w:ascii="MS Gothic" w:eastAsia="MS Gothic" w:hAnsi="MS Gothic" w:hint="eastAsia"/>
-                    <w:lang w:val="vi-VN" w:eastAsia="ko-KR"/>
-                  </w:rPr>
-                  <w:t>☐</w:t>
-                </w:r>
-              </w:sdtContent>
-            </w:sdt>
-          </w:p>
-        </w:tc>
-        <w:tc>
-          <w:tcPr>
-            <w:tcW w:w="0" w:type="auto"/>
-            <w:vAlign w:val="center"/>
-          </w:tcPr>
-          <w:p>
-            <w:pPr>
-              <w:spacing w:before="60" w:after="60"/>
-              <w:jc w:val="center"/>
-              <w:rPr>
-                <w:rFonts w:cs="Times New Roman"/>
-                <w:lang w:eastAsia="ko-KR"/>
-              </w:rPr>
-            </w:pPr>
-            <w:sdt>
-              <w:sdtPr>
-                <w:rPr>
-                  <w:lang w:val="vi-VN" w:eastAsia="ko-KR"/>
-                </w:rPr>
-                <w:id w:val="-1686126712"/>
-                <w14:checkbox>
-                  <w14:checked w14:val="0"/>
-                  <w14:checkedState w14:val="2612" w14:font="MS Gothic"/>
-                  <w14:uncheckedState w14:val="2610" w14:font="MS Gothic"/>
-                </w14:checkbox>
-              </w:sdtPr>
-              <w:sdtContent>
-                <w:r>
-                  <w:rPr>
-                    <w:rFonts w:ascii="MS Gothic" w:eastAsia="MS Gothic" w:hAnsi="MS Gothic" w:hint="eastAsia"/>
-                    <w:lang w:val="vi-VN" w:eastAsia="ko-KR"/>
-                  </w:rPr>
-                  <w:t>☐</w:t>
-                </w:r>
-              </w:sdtContent>
-            </w:sdt>
-          </w:p>
-        </w:tc>
-        <w:tc>
-          <w:tcPr>
-            <w:tcW w:w="0" w:type="auto"/>
-            <w:vAlign w:val="center"/>
-          </w:tcPr>
-          <w:p>
-            <w:pPr>
-              <w:spacing w:before="60" w:after="60"/>
-              <w:jc w:val="center"/>
-              <w:rPr>
-                <w:rFonts w:cs="Times New Roman"/>
-                <w:lang w:eastAsia="ko-KR"/>
-              </w:rPr>
-            </w:pPr>
-            <w:sdt>
-              <w:sdtPr>
-                <w:rPr>
-                  <w:lang w:val="vi-VN" w:eastAsia="ko-KR"/>
-                </w:rPr>
-                <w:id w:val="-1732681464"/>
-                <w14:checkbox>
-                  <w14:checked w14:val="0"/>
-                  <w14:checkedState w14:val="2612" w14:font="MS Gothic"/>
-                  <w14:uncheckedState w14:val="2610" w14:font="MS Gothic"/>
-                </w14:checkbox>
-              </w:sdtPr>
-              <w:sdtContent>
-                <w:r>
-                  <w:rPr>
-                    <w:rFonts w:ascii="MS Gothic" w:eastAsia="MS Gothic" w:hAnsi="MS Gothic" w:hint="eastAsia"/>
-                    <w:lang w:val="vi-VN" w:eastAsia="ko-KR"/>
-                  </w:rPr>
-                  <w:t>☐</w:t>
-                </w:r>
-              </w:sdtContent>
-            </w:sdt>
-          </w:p>
-        </w:tc>
-      </w:tr>
-      <w:tr>
-        <w:tc>
-          <w:tcPr>
-            <w:tcW w:w="0" w:type="auto"/>
-            <w:vAlign w:val="center"/>
-          </w:tcPr>
-          <w:p>
-            <w:pPr>
-              <w:spacing w:before="60" w:after="60"/>
-              <w:jc w:val="center"/>
-              <w:rPr>
-                <w:rFonts w:cs="Times New Roman"/>
-                <w:lang w:val="vi-VN" w:eastAsia="ko-KR"/>
-              </w:rPr>
-            </w:pPr>
-            <w:sdt>
-              <w:sdtPr>
-                <w:rPr>
-                  <w:lang w:val="vi-VN" w:eastAsia="ko-KR"/>
-                </w:rPr>
-                <w:id w:val="-1982926930"/>
-                <w14:checkbox>
-                  <w14:checked w14:val="0"/>
-                  <w14:checkedState w14:val="2612" w14:font="MS Gothic"/>
-                  <w14:uncheckedState w14:val="2610" w14:font="MS Gothic"/>
-                </w14:checkbox>
-              </w:sdtPr>
-              <w:sdtContent>
-                <w:r>
-                  <w:rPr>
-                    <w:rFonts w:ascii="MS Gothic" w:eastAsia="MS Gothic" w:hAnsi="MS Gothic" w:hint="eastAsia"/>
-                    <w:lang w:val="vi-VN" w:eastAsia="ko-KR"/>
-                  </w:rPr>
-                  <w:t>☐</w:t>
-                </w:r>
-              </w:sdtContent>
-            </w:sdt>
-          </w:p>
-        </w:tc>
-        <w:tc>
-          <w:tcPr>
-            <w:tcW w:w="0" w:type="auto"/>
-            <w:vAlign w:val="center"/>
-          </w:tcPr>
-          <w:p>
-            <w:pPr>
-              <w:spacing w:before="60" w:after="60"/>
-              <w:jc w:val="left"/>
-              <w:rPr>
-                <w:rFonts w:cs="Times New Roman"/>
-                <w:lang w:val="vi-VN" w:eastAsia="ko-KR"/>
-              </w:rPr>
-            </w:pPr>
-            <w:r>
-              <w:rPr>
-                <w:rFonts w:cs="Times New Roman"/>
-                <w:lang w:eastAsia="ko-KR"/>
-              </w:rPr>
-              <w:t>Lập trình / Website</w:t>
-            </w:r>
-          </w:p>
-        </w:tc>
-        <w:tc>
-          <w:tcPr>
-            <w:tcW w:w="0" w:type="auto"/>
-            <w:vAlign w:val="center"/>
-          </w:tcPr>
-          <w:p>
-            <w:pPr>
-              <w:spacing w:before="60" w:after="60"/>
-              <w:jc w:val="center"/>
-              <w:rPr>
-                <w:rFonts w:cs="Times New Roman"/>
-                <w:lang w:eastAsia="ko-KR"/>
-              </w:rPr>
-            </w:pPr>
-            <w:sdt>
-              <w:sdtPr>
-                <w:rPr>
-                  <w:lang w:val="vi-VN" w:eastAsia="ko-KR"/>
-                </w:rPr>
-                <w:id w:val="-2111731057"/>
-                <w14:checkbox>
-                  <w14:checked w14:val="0"/>
-                  <w14:checkedState w14:val="2612" w14:font="MS Gothic"/>
-                  <w14:uncheckedState w14:val="2610" w14:font="MS Gothic"/>
-                </w14:checkbox>
-              </w:sdtPr>
-              <w:sdtContent>
-                <w:r>
-                  <w:rPr>
-                    <w:rFonts w:ascii="MS Gothic" w:eastAsia="MS Gothic" w:hAnsi="MS Gothic" w:hint="eastAsia"/>
-                    <w:lang w:val="vi-VN" w:eastAsia="ko-KR"/>
-                  </w:rPr>
-                  <w:t>☐</w:t>
-                </w:r>
-              </w:sdtContent>
-            </w:sdt>
-          </w:p>
-        </w:tc>
-        <w:tc>
-          <w:tcPr>
-            <w:tcW w:w="0" w:type="auto"/>
-            <w:vAlign w:val="center"/>
-          </w:tcPr>
-          <w:p>
-            <w:pPr>
-              <w:spacing w:before="60" w:after="60"/>
-              <w:jc w:val="center"/>
-              <w:rPr>
-                <w:rFonts w:cs="Times New Roman"/>
-                <w:lang w:eastAsia="ko-KR"/>
-              </w:rPr>
-            </w:pPr>
-            <w:sdt>
-              <w:sdtPr>
-                <w:rPr>
-                  <w:lang w:val="vi-VN" w:eastAsia="ko-KR"/>
-                </w:rPr>
-                <w:id w:val="-777320929"/>
-                <w14:checkbox>
-                  <w14:checked w14:val="0"/>
-                  <w14:checkedState w14:val="2612" w14:font="MS Gothic"/>
-                  <w14:uncheckedState w14:val="2610" w14:font="MS Gothic"/>
-                </w14:checkbox>
-              </w:sdtPr>
-              <w:sdtContent>
-                <w:r>
-                  <w:rPr>
-                    <w:rFonts w:ascii="MS Gothic" w:eastAsia="MS Gothic" w:hAnsi="MS Gothic" w:hint="eastAsia"/>
-                    <w:lang w:val="vi-VN" w:eastAsia="ko-KR"/>
-                  </w:rPr>
-                  <w:t>☐</w:t>
-                </w:r>
-              </w:sdtContent>
-            </w:sdt>
-          </w:p>
-        </w:tc>
-        <w:tc>
-          <w:tcPr>
-            <w:tcW w:w="0" w:type="auto"/>
-            <w:vAlign w:val="center"/>
-          </w:tcPr>
-          <w:p>
-            <w:pPr>
-              <w:spacing w:before="60" w:after="60"/>
-              <w:jc w:val="center"/>
-              <w:rPr>
-                <w:rFonts w:cs="Times New Roman"/>
-                <w:lang w:eastAsia="ko-KR"/>
-              </w:rPr>
-            </w:pPr>
-            <w:sdt>
-              <w:sdtPr>
-                <w:rPr>
-                  <w:lang w:val="vi-VN" w:eastAsia="ko-KR"/>
-                </w:rPr>
-                <w:id w:val="-969436940"/>
-                <w14:checkbox>
-                  <w14:checked w14:val="0"/>
-                  <w14:checkedState w14:val="2612" w14:font="MS Gothic"/>
-                  <w14:uncheckedState w14:val="2610" w14:font="MS Gothic"/>
-                </w14:checkbox>
-              </w:sdtPr>
-              <w:sdtContent>
-                <w:r>
-                  <w:rPr>
-                    <w:rFonts w:ascii="MS Gothic" w:eastAsia="MS Gothic" w:hAnsi="MS Gothic" w:hint="eastAsia"/>
-                    <w:lang w:val="vi-VN" w:eastAsia="ko-KR"/>
-                  </w:rPr>
-                  <w:t>☐</w:t>
-                </w:r>
-              </w:sdtContent>
-            </w:sdt>
-          </w:p>
-        </w:tc>
-      </w:tr>
-      <w:tr>
-        <w:tc>
-          <w:tcPr>
-            <w:tcW w:w="0" w:type="auto"/>
-            <w:vAlign w:val="center"/>
-          </w:tcPr>
-          <w:p>
-            <w:pPr>
-              <w:spacing w:before="60" w:after="60"/>
-              <w:jc w:val="center"/>
-              <w:rPr>
-                <w:rFonts w:cs="Times New Roman"/>
-                <w:lang w:val="vi-VN" w:eastAsia="ko-KR"/>
-              </w:rPr>
-            </w:pPr>
-            <w:sdt>
-              <w:sdtPr>
-                <w:rPr>
-                  <w:lang w:val="vi-VN" w:eastAsia="ko-KR"/>
-                </w:rPr>
-                <w:id w:val="-1647196207"/>
-                <w14:checkbox>
-                  <w14:checked w14:val="0"/>
-                  <w14:checkedState w14:val="2612" w14:font="MS Gothic"/>
-                  <w14:uncheckedState w14:val="2610" w14:font="MS Gothic"/>
-                </w14:checkbox>
-              </w:sdtPr>
-              <w:sdtContent>
-                <w:r>
-                  <w:rPr>
-                    <w:rFonts w:ascii="MS Gothic" w:eastAsia="MS Gothic" w:hAnsi="MS Gothic" w:hint="eastAsia"/>
-                    <w:lang w:val="vi-VN" w:eastAsia="ko-KR"/>
-                  </w:rPr>
-                  <w:t>☐</w:t>
-                </w:r>
-              </w:sdtContent>
-            </w:sdt>
-          </w:p>
-        </w:tc>
-        <w:tc>
-          <w:tcPr>
-            <w:tcW w:w="0" w:type="auto"/>
-            <w:vAlign w:val="center"/>
-          </w:tcPr>
-          <w:p>
-            <w:pPr>
-              <w:spacing w:before="60" w:after="60"/>
-              <w:jc w:val="left"/>
-              <w:rPr>
-                <w:rFonts w:cs="Times New Roman"/>
-                <w:lang w:val="vi-VN" w:eastAsia="ko-KR"/>
-              </w:rPr>
-            </w:pPr>
-            <w:r>
-              <w:rPr>
-                <w:rFonts w:cs="Times New Roman"/>
-                <w:lang w:val="vi-VN" w:eastAsia="ko-KR"/>
-              </w:rPr>
-              <w:t>MC / Tổ chức sự kiện</w:t>
-            </w:r>
-          </w:p>
-        </w:tc>
-        <w:tc>
-          <w:tcPr>
-            <w:tcW w:w="0" w:type="auto"/>
-            <w:vAlign w:val="center"/>
-          </w:tcPr>
-          <w:p>
-            <w:pPr>
-              <w:spacing w:before="60" w:after="60"/>
-              <w:jc w:val="center"/>
-              <w:rPr>
-                <w:rFonts w:cs="Times New Roman"/>
-                <w:lang w:val="vi-VN" w:eastAsia="ko-KR"/>
-              </w:rPr>
-            </w:pPr>
-            <w:sdt>
-              <w:sdtPr>
-                <w:rPr>
-                  <w:lang w:val="vi-VN" w:eastAsia="ko-KR"/>
-                </w:rPr>
-                <w:id w:val="-121077671"/>
-                <w14:checkbox>
-                  <w14:checked w14:val="0"/>
-                  <w14:checkedState w14:val="2612" w14:font="MS Gothic"/>
-                  <w14:uncheckedState w14:val="2610" w14:font="MS Gothic"/>
-                </w14:checkbox>
-              </w:sdtPr>
-              <w:sdtContent>
-                <w:r>
-                  <w:rPr>
-                    <w:rFonts w:ascii="MS Gothic" w:eastAsia="MS Gothic" w:hAnsi="MS Gothic" w:hint="eastAsia"/>
-                    <w:lang w:val="vi-VN" w:eastAsia="ko-KR"/>
-                  </w:rPr>
-                  <w:t>☐</w:t>
-                </w:r>
-              </w:sdtContent>
-            </w:sdt>
-          </w:p>
-        </w:tc>
-        <w:tc>
-          <w:tcPr>
-            <w:tcW w:w="0" w:type="auto"/>
-            <w:vAlign w:val="center"/>
-          </w:tcPr>
-          <w:p>
-            <w:pPr>
-              <w:spacing w:before="60" w:after="60"/>
-              <w:jc w:val="center"/>
-              <w:rPr>
-                <w:rFonts w:cs="Times New Roman"/>
-                <w:lang w:val="vi-VN" w:eastAsia="ko-KR"/>
-              </w:rPr>
-            </w:pPr>
-            <w:sdt>
-              <w:sdtPr>
-                <w:rPr>
-                  <w:lang w:val="vi-VN" w:eastAsia="ko-KR"/>
-                </w:rPr>
-                <w:id w:val="1537234176"/>
-                <w14:checkbox>
-                  <w14:checked w14:val="0"/>
-                  <w14:checkedState w14:val="2612" w14:font="MS Gothic"/>
-                  <w14:uncheckedState w14:val="2610" w14:font="MS Gothic"/>
-                </w14:checkbox>
-              </w:sdtPr>
-              <w:sdtContent>
-                <w:r>
-                  <w:rPr>
-                    <w:rFonts w:ascii="MS Gothic" w:eastAsia="MS Gothic" w:hAnsi="MS Gothic" w:hint="eastAsia"/>
-                    <w:lang w:val="vi-VN" w:eastAsia="ko-KR"/>
-                  </w:rPr>
-                  <w:t>☐</w:t>
-                </w:r>
-              </w:sdtContent>
-            </w:sdt>
-          </w:p>
-        </w:tc>
-        <w:tc>
-          <w:tcPr>
-            <w:tcW w:w="0" w:type="auto"/>
-            <w:vAlign w:val="center"/>
-          </w:tcPr>
-          <w:p>
-            <w:pPr>
-              <w:spacing w:before="60" w:after="60"/>
-              <w:jc w:val="center"/>
-              <w:rPr>
-                <w:rFonts w:cs="Times New Roman"/>
-                <w:lang w:val="vi-VN" w:eastAsia="ko-KR"/>
-              </w:rPr>
-            </w:pPr>
-            <w:sdt>
-              <w:sdtPr>
-                <w:rPr>
-                  <w:lang w:val="vi-VN" w:eastAsia="ko-KR"/>
-                </w:rPr>
-                <w:id w:val="-1749881335"/>
-                <w14:checkbox>
-                  <w14:checked w14:val="0"/>
-                  <w14:checkedState w14:val="2612" w14:font="MS Gothic"/>
-                  <w14:uncheckedState w14:val="2610" w14:font="MS Gothic"/>
-                </w14:checkbox>
-              </w:sdtPr>
-              <w:sdtContent>
-                <w:r>
-                  <w:rPr>
-                    <w:rFonts w:ascii="MS Gothic" w:eastAsia="MS Gothic" w:hAnsi="MS Gothic" w:hint="eastAsia"/>
-                    <w:lang w:val="vi-VN" w:eastAsia="ko-KR"/>
-                  </w:rPr>
-                  <w:t>☐</w:t>
-                </w:r>
-              </w:sdtContent>
-            </w:sdt>
-          </w:p>
-        </w:tc>
-      </w:tr>
-      <w:tr>
-        <w:tc>
-          <w:tcPr>
-            <w:tcW w:w="0" w:type="auto"/>
-            <w:vAlign w:val="center"/>
-          </w:tcPr>
-          <w:p>
-            <w:pPr>
-              <w:spacing w:before="120"/>
-              <w:jc w:val="center"/>
-              <w:rPr>
-                <w:rFonts w:cs="Times New Roman"/>
-                <w:lang w:val="vi-VN" w:eastAsia="ko-KR"/>
-              </w:rPr>
-            </w:pPr>
-            <w:sdt>
-              <w:sdtPr>
-                <w:rPr>
-                  <w:lang w:val="vi-VN" w:eastAsia="ko-KR"/>
-                </w:rPr>
-                <w:id w:val="1515955124"/>
-                <w14:checkbox>
-                  <w14:checked w14:val="0"/>
-                  <w14:checkedState w14:val="2612" w14:font="MS Gothic"/>
-                  <w14:uncheckedState w14:val="2610" w14:font="MS Gothic"/>
-                </w14:checkbox>
-              </w:sdtPr>
-              <w:sdtContent>
-                <w:r>
-                  <w:rPr>
-                    <w:rFonts w:ascii="MS Gothic" w:eastAsia="MS Gothic" w:hAnsi="MS Gothic" w:hint="eastAsia"/>
-                    <w:lang w:val="vi-VN" w:eastAsia="ko-KR"/>
-                  </w:rPr>
-                  <w:t>☐</w:t>
-                </w:r>
-              </w:sdtContent>
-            </w:sdt>
+              <w:t>}}</w:t>
+            </w:r>
           </w:p>
         </w:tc>
         <w:tc>
@@ -2373,7 +2136,7 @@
                 <w:rFonts w:cs="Times New Roman"/>
                 <w:lang w:val="vi-VN" w:eastAsia="ko-KR"/>
               </w:rPr>
-              <w:tab/>
+              <w:t xml:space="preserve"> {{ Skill_Khac_Text }}</w:t>
             </w:r>
           </w:p>
         </w:tc>
@@ -2384,38 +2147,11 @@
           </w:tcPr>
           <w:p>
             <w:pPr>
-              <w:tabs>
-                <w:tab w:val="left" w:leader="dot" w:pos="7150"/>
-              </w:tabs>
-              <w:spacing w:before="120"/>
-              <w:jc w:val="center"/>
-              <w:rPr>
-                <w:rFonts w:cs="Times New Roman"/>
+              <w:pStyle w:val="NoSpacing"/>
+              <w:rPr>
                 <w:lang w:eastAsia="ko-KR"/>
               </w:rPr>
             </w:pPr>
-            <w:sdt>
-              <w:sdtPr>
-                <w:rPr>
-                  <w:lang w:val="vi-VN" w:eastAsia="ko-KR"/>
-                </w:rPr>
-                <w:id w:val="1359160439"/>
-                <w14:checkbox>
-                  <w14:checked w14:val="0"/>
-                  <w14:checkedState w14:val="2612" w14:font="MS Gothic"/>
-                  <w14:uncheckedState w14:val="2610" w14:font="MS Gothic"/>
-                </w14:checkbox>
-              </w:sdtPr>
-              <w:sdtContent>
-                <w:r>
-                  <w:rPr>
-                    <w:rFonts w:ascii="MS Gothic" w:eastAsia="MS Gothic" w:hAnsi="MS Gothic" w:hint="eastAsia"/>
-                    <w:lang w:val="vi-VN" w:eastAsia="ko-KR"/>
-                  </w:rPr>
-                  <w:t>☐</w:t>
-                </w:r>
-              </w:sdtContent>
-            </w:sdt>
           </w:p>
         </w:tc>
         <w:tc>
@@ -2425,38 +2161,11 @@
           </w:tcPr>
           <w:p>
             <w:pPr>
-              <w:tabs>
-                <w:tab w:val="left" w:leader="dot" w:pos="7150"/>
-              </w:tabs>
-              <w:spacing w:before="120"/>
-              <w:jc w:val="center"/>
-              <w:rPr>
-                <w:rFonts w:cs="Times New Roman"/>
+              <w:pStyle w:val="NoSpacing"/>
+              <w:rPr>
                 <w:lang w:eastAsia="ko-KR"/>
               </w:rPr>
             </w:pPr>
-            <w:sdt>
-              <w:sdtPr>
-                <w:rPr>
-                  <w:lang w:val="vi-VN" w:eastAsia="ko-KR"/>
-                </w:rPr>
-                <w:id w:val="1942412256"/>
-                <w14:checkbox>
-                  <w14:checked w14:val="0"/>
-                  <w14:checkedState w14:val="2612" w14:font="MS Gothic"/>
-                  <w14:uncheckedState w14:val="2610" w14:font="MS Gothic"/>
-                </w14:checkbox>
-              </w:sdtPr>
-              <w:sdtContent>
-                <w:r>
-                  <w:rPr>
-                    <w:rFonts w:ascii="MS Gothic" w:eastAsia="MS Gothic" w:hAnsi="MS Gothic" w:hint="eastAsia"/>
-                    <w:lang w:val="vi-VN" w:eastAsia="ko-KR"/>
-                  </w:rPr>
-                  <w:t>☐</w:t>
-                </w:r>
-              </w:sdtContent>
-            </w:sdt>
           </w:p>
         </w:tc>
         <w:tc>
@@ -2466,38 +2175,11 @@
           </w:tcPr>
           <w:p>
             <w:pPr>
-              <w:tabs>
-                <w:tab w:val="left" w:leader="dot" w:pos="7150"/>
-              </w:tabs>
-              <w:spacing w:before="120"/>
-              <w:jc w:val="center"/>
-              <w:rPr>
-                <w:rFonts w:cs="Times New Roman"/>
+              <w:pStyle w:val="NoSpacing"/>
+              <w:rPr>
                 <w:lang w:eastAsia="ko-KR"/>
               </w:rPr>
             </w:pPr>
-            <w:sdt>
-              <w:sdtPr>
-                <w:rPr>
-                  <w:lang w:val="vi-VN" w:eastAsia="ko-KR"/>
-                </w:rPr>
-                <w:id w:val="1578863656"/>
-                <w14:checkbox>
-                  <w14:checked w14:val="0"/>
-                  <w14:checkedState w14:val="2612" w14:font="MS Gothic"/>
-                  <w14:uncheckedState w14:val="2610" w14:font="MS Gothic"/>
-                </w14:checkbox>
-              </w:sdtPr>
-              <w:sdtContent>
-                <w:r>
-                  <w:rPr>
-                    <w:rFonts w:ascii="MS Gothic" w:eastAsia="MS Gothic" w:hAnsi="MS Gothic" w:hint="eastAsia"/>
-                    <w:lang w:val="vi-VN" w:eastAsia="ko-KR"/>
-                  </w:rPr>
-                  <w:t>☐</w:t>
-                </w:r>
-              </w:sdtContent>
-            </w:sdt>
           </w:p>
         </w:tc>
       </w:tr>
@@ -2508,14 +2190,18 @@
         <w:tblStyle w:val="TableGrid"/>
         <w:tblW w:w="0" w:type="auto"/>
         <w:tblInd w:w="279" w:type="dxa"/>
+        <w:tblCellMar>
+          <w:top w:w="57" w:type="dxa"/>
+          <w:bottom w:w="57" w:type="dxa"/>
+        </w:tblCellMar>
         <w:tblLook w:val="04A0" w:firstRow="1" w:lastRow="0" w:firstColumn="1" w:lastColumn="0" w:noHBand="0" w:noVBand="1"/>
       </w:tblPr>
       <w:tblGrid>
-        <w:gridCol w:w="456"/>
-        <w:gridCol w:w="5604"/>
-        <w:gridCol w:w="910"/>
-        <w:gridCol w:w="1281"/>
-        <w:gridCol w:w="550"/>
+        <w:gridCol w:w="1158"/>
+        <w:gridCol w:w="3399"/>
+        <w:gridCol w:w="1507"/>
+        <w:gridCol w:w="1467"/>
+        <w:gridCol w:w="1534"/>
       </w:tblGrid>
       <w:tr>
         <w:tc>
@@ -2542,7 +2228,6 @@
                 <w:bCs/>
                 <w:lang w:val="vi-VN" w:eastAsia="ko-KR"/>
               </w:rPr>
-              <w:lastRenderedPageBreak/>
               <w:t>KỸ NĂNG MỀM</w:t>
             </w:r>
           </w:p>
@@ -2696,58 +2381,639 @@
           </w:tcPr>
           <w:p>
             <w:pPr>
-              <w:spacing w:before="60" w:after="60"/>
-              <w:jc w:val="center"/>
+              <w:pStyle w:val="NoSpacing"/>
+              <w:rPr>
+                <w:lang w:eastAsia="ko-KR"/>
+              </w:rPr>
+            </w:pPr>
+            <w:r>
+              <w:rPr>
+                <w:lang w:eastAsia="ko-KR"/>
+              </w:rPr>
+              <w:t>{{gt}}</w:t>
+            </w:r>
+          </w:p>
+        </w:tc>
+        <w:tc>
+          <w:tcPr>
+            <w:tcW w:w="0" w:type="auto"/>
+          </w:tcPr>
+          <w:p>
+            <w:pPr>
+              <w:pStyle w:val="NoSpacing"/>
+              <w:rPr>
+                <w:lang w:val="vi-VN" w:eastAsia="ko-KR"/>
+              </w:rPr>
+            </w:pPr>
+            <w:r>
+              <w:rPr>
+                <w:lang w:val="vi-VN" w:eastAsia="ko-KR"/>
+              </w:rPr>
+              <w:t>Giao tiếp</w:t>
+            </w:r>
+          </w:p>
+        </w:tc>
+        <w:tc>
+          <w:tcPr>
+            <w:tcW w:w="0" w:type="auto"/>
+            <w:vAlign w:val="center"/>
+          </w:tcPr>
+          <w:p>
+            <w:pPr>
+              <w:pStyle w:val="NoSpacing"/>
+              <w:rPr>
+                <w:lang w:val="vi-VN" w:eastAsia="ko-KR"/>
+              </w:rPr>
+            </w:pPr>
+            <w:r>
+              <w:t>{{ gt_cb }}</w:t>
+            </w:r>
+          </w:p>
+        </w:tc>
+        <w:tc>
+          <w:tcPr>
+            <w:tcW w:w="0" w:type="auto"/>
+            <w:vAlign w:val="center"/>
+          </w:tcPr>
+          <w:p>
+            <w:pPr>
+              <w:pStyle w:val="NoSpacing"/>
+              <w:rPr>
+                <w:lang w:eastAsia="ko-KR"/>
+              </w:rPr>
+            </w:pPr>
+            <w:r>
+              <w:t>{{ gt_tb }}</w:t>
+            </w:r>
+          </w:p>
+        </w:tc>
+        <w:tc>
+          <w:tcPr>
+            <w:tcW w:w="0" w:type="auto"/>
+            <w:vAlign w:val="center"/>
+          </w:tcPr>
+          <w:p>
+            <w:pPr>
+              <w:pStyle w:val="NoSpacing"/>
+              <w:rPr>
+                <w:lang w:eastAsia="ko-KR"/>
+              </w:rPr>
+            </w:pPr>
+            <w:r>
+              <w:t>{{ gt_tot }}</w:t>
+            </w:r>
+          </w:p>
+        </w:tc>
+      </w:tr>
+      <w:tr>
+        <w:tc>
+          <w:tcPr>
+            <w:tcW w:w="0" w:type="auto"/>
+            <w:vAlign w:val="center"/>
+          </w:tcPr>
+          <w:p>
+            <w:pPr>
+              <w:pStyle w:val="NoSpacing"/>
+              <w:rPr>
+                <w:lang w:val="vi-VN" w:eastAsia="ko-KR"/>
+              </w:rPr>
+            </w:pPr>
+            <w:r>
+              <w:rPr>
+                <w:lang w:eastAsia="ko-KR"/>
+              </w:rPr>
+              <w:t>{{</w:t>
+            </w:r>
+            <w:r>
+              <w:rPr>
+                <w:lang w:eastAsia="ko-KR"/>
+              </w:rPr>
+              <w:t>lvn</w:t>
+            </w:r>
+            <w:r>
+              <w:rPr>
+                <w:lang w:eastAsia="ko-KR"/>
+              </w:rPr>
+              <w:t>}}</w:t>
+            </w:r>
+          </w:p>
+        </w:tc>
+        <w:tc>
+          <w:tcPr>
+            <w:tcW w:w="0" w:type="auto"/>
+          </w:tcPr>
+          <w:p>
+            <w:pPr>
+              <w:pStyle w:val="NoSpacing"/>
+              <w:rPr>
+                <w:lang w:val="vi-VN" w:eastAsia="ko-KR"/>
+              </w:rPr>
+            </w:pPr>
+            <w:r>
+              <w:rPr>
+                <w:lang w:val="vi-VN" w:eastAsia="ko-KR"/>
+              </w:rPr>
+              <w:t>Làm việc nhóm</w:t>
+            </w:r>
+          </w:p>
+        </w:tc>
+        <w:tc>
+          <w:tcPr>
+            <w:tcW w:w="0" w:type="auto"/>
+            <w:vAlign w:val="center"/>
+          </w:tcPr>
+          <w:p>
+            <w:pPr>
+              <w:pStyle w:val="NoSpacing"/>
+              <w:rPr>
+                <w:lang w:eastAsia="ko-KR"/>
+              </w:rPr>
+            </w:pPr>
+            <w:r>
+              <w:t>{{ lvn_cb }}</w:t>
+            </w:r>
+          </w:p>
+        </w:tc>
+        <w:tc>
+          <w:tcPr>
+            <w:tcW w:w="0" w:type="auto"/>
+            <w:vAlign w:val="center"/>
+          </w:tcPr>
+          <w:p>
+            <w:pPr>
+              <w:pStyle w:val="NoSpacing"/>
+              <w:rPr>
+                <w:lang w:eastAsia="ko-KR"/>
+              </w:rPr>
+            </w:pPr>
+            <w:r>
+              <w:t>{{ lvn_tb }}</w:t>
+            </w:r>
+          </w:p>
+        </w:tc>
+        <w:tc>
+          <w:tcPr>
+            <w:tcW w:w="0" w:type="auto"/>
+            <w:vAlign w:val="center"/>
+          </w:tcPr>
+          <w:p>
+            <w:pPr>
+              <w:pStyle w:val="NoSpacing"/>
+              <w:rPr>
+                <w:lang w:eastAsia="ko-KR"/>
+              </w:rPr>
+            </w:pPr>
+            <w:r>
+              <w:t>{{ lvn_tot }}</w:t>
+            </w:r>
+          </w:p>
+        </w:tc>
+      </w:tr>
+      <w:tr>
+        <w:tc>
+          <w:tcPr>
+            <w:tcW w:w="0" w:type="auto"/>
+            <w:vAlign w:val="center"/>
+          </w:tcPr>
+          <w:p>
+            <w:pPr>
+              <w:pStyle w:val="NoSpacing"/>
+              <w:rPr>
+                <w:lang w:val="vi-VN" w:eastAsia="ko-KR"/>
+              </w:rPr>
+            </w:pPr>
+            <w:r>
+              <w:rPr>
+                <w:lang w:eastAsia="ko-KR"/>
+              </w:rPr>
+              <w:t>{{</w:t>
+            </w:r>
+            <w:r>
+              <w:rPr>
+                <w:lang w:eastAsia="ko-KR"/>
+              </w:rPr>
+              <w:t>qltg</w:t>
+            </w:r>
+            <w:r>
+              <w:rPr>
+                <w:lang w:eastAsia="ko-KR"/>
+              </w:rPr>
+              <w:t>}}</w:t>
+            </w:r>
+          </w:p>
+        </w:tc>
+        <w:tc>
+          <w:tcPr>
+            <w:tcW w:w="0" w:type="auto"/>
+          </w:tcPr>
+          <w:p>
+            <w:pPr>
+              <w:pStyle w:val="NoSpacing"/>
+              <w:rPr>
+                <w:lang w:val="vi-VN" w:eastAsia="ko-KR"/>
+              </w:rPr>
+            </w:pPr>
+            <w:r>
+              <w:rPr>
+                <w:lang w:val="vi-VN" w:eastAsia="ko-KR"/>
+              </w:rPr>
+              <w:t>Quản lý thời gian</w:t>
+            </w:r>
+          </w:p>
+        </w:tc>
+        <w:tc>
+          <w:tcPr>
+            <w:tcW w:w="0" w:type="auto"/>
+            <w:vAlign w:val="center"/>
+          </w:tcPr>
+          <w:p>
+            <w:pPr>
+              <w:pStyle w:val="NoSpacing"/>
+              <w:rPr>
+                <w:lang w:eastAsia="ko-KR"/>
+              </w:rPr>
+            </w:pPr>
+            <w:r>
+              <w:t>{{ qltg_cb }}</w:t>
+            </w:r>
+          </w:p>
+        </w:tc>
+        <w:tc>
+          <w:tcPr>
+            <w:tcW w:w="0" w:type="auto"/>
+            <w:vAlign w:val="center"/>
+          </w:tcPr>
+          <w:p>
+            <w:pPr>
+              <w:pStyle w:val="NoSpacing"/>
+              <w:rPr>
+                <w:lang w:eastAsia="ko-KR"/>
+              </w:rPr>
+            </w:pPr>
+            <w:r>
+              <w:t>{{ qltg_tb }}</w:t>
+            </w:r>
+          </w:p>
+        </w:tc>
+        <w:tc>
+          <w:tcPr>
+            <w:tcW w:w="0" w:type="auto"/>
+            <w:vAlign w:val="center"/>
+          </w:tcPr>
+          <w:p>
+            <w:pPr>
+              <w:pStyle w:val="NoSpacing"/>
+              <w:rPr>
+                <w:lang w:eastAsia="ko-KR"/>
+              </w:rPr>
+            </w:pPr>
+            <w:r>
+              <w:t>{{ qltg_tot }}</w:t>
+            </w:r>
+          </w:p>
+        </w:tc>
+      </w:tr>
+      <w:tr>
+        <w:tc>
+          <w:tcPr>
+            <w:tcW w:w="0" w:type="auto"/>
+            <w:vAlign w:val="center"/>
+          </w:tcPr>
+          <w:p>
+            <w:pPr>
+              <w:pStyle w:val="NoSpacing"/>
+              <w:rPr>
+                <w:lang w:val="vi-VN" w:eastAsia="ko-KR"/>
+              </w:rPr>
+            </w:pPr>
+            <w:r>
+              <w:rPr>
+                <w:lang w:eastAsia="ko-KR"/>
+              </w:rPr>
+              <w:t>{{</w:t>
+            </w:r>
+            <w:r>
+              <w:rPr>
+                <w:lang w:eastAsia="ko-KR"/>
+              </w:rPr>
+              <w:t>st</w:t>
+            </w:r>
+            <w:r>
+              <w:rPr>
+                <w:lang w:eastAsia="ko-KR"/>
+              </w:rPr>
+              <w:t>}}</w:t>
+            </w:r>
+          </w:p>
+        </w:tc>
+        <w:tc>
+          <w:tcPr>
+            <w:tcW w:w="0" w:type="auto"/>
+          </w:tcPr>
+          <w:p>
+            <w:pPr>
+              <w:pStyle w:val="NoSpacing"/>
+              <w:rPr>
+                <w:lang w:val="vi-VN" w:eastAsia="ko-KR"/>
+              </w:rPr>
+            </w:pPr>
+            <w:r>
+              <w:rPr>
+                <w:lang w:val="vi-VN" w:eastAsia="ko-KR"/>
+              </w:rPr>
+              <w:t>Sáng tạo</w:t>
+            </w:r>
+          </w:p>
+        </w:tc>
+        <w:tc>
+          <w:tcPr>
+            <w:tcW w:w="0" w:type="auto"/>
+            <w:vAlign w:val="center"/>
+          </w:tcPr>
+          <w:p>
+            <w:pPr>
+              <w:pStyle w:val="NoSpacing"/>
+              <w:rPr>
+                <w:lang w:eastAsia="ko-KR"/>
+              </w:rPr>
+            </w:pPr>
+            <w:r>
+              <w:t>{{ st_cb }}</w:t>
+            </w:r>
+          </w:p>
+        </w:tc>
+        <w:tc>
+          <w:tcPr>
+            <w:tcW w:w="0" w:type="auto"/>
+            <w:vAlign w:val="center"/>
+          </w:tcPr>
+          <w:p>
+            <w:pPr>
+              <w:pStyle w:val="NoSpacing"/>
+              <w:rPr>
+                <w:lang w:eastAsia="ko-KR"/>
+              </w:rPr>
+            </w:pPr>
+            <w:r>
+              <w:t>{{ st_tb }}</w:t>
+            </w:r>
+          </w:p>
+        </w:tc>
+        <w:tc>
+          <w:tcPr>
+            <w:tcW w:w="0" w:type="auto"/>
+            <w:vAlign w:val="center"/>
+          </w:tcPr>
+          <w:p>
+            <w:pPr>
+              <w:pStyle w:val="NoSpacing"/>
+              <w:rPr>
+                <w:lang w:eastAsia="ko-KR"/>
+              </w:rPr>
+            </w:pPr>
+            <w:r>
+              <w:t>{{ st_tot }}</w:t>
+            </w:r>
+          </w:p>
+        </w:tc>
+      </w:tr>
+      <w:tr>
+        <w:tc>
+          <w:tcPr>
+            <w:tcW w:w="0" w:type="auto"/>
+            <w:vAlign w:val="center"/>
+          </w:tcPr>
+          <w:p>
+            <w:pPr>
+              <w:pStyle w:val="NoSpacing"/>
+              <w:rPr>
+                <w:lang w:val="vi-VN" w:eastAsia="ko-KR"/>
+              </w:rPr>
+            </w:pPr>
+            <w:r>
+              <w:rPr>
+                <w:lang w:eastAsia="ko-KR"/>
+              </w:rPr>
+              <w:t>{{</w:t>
+            </w:r>
+            <w:r>
+              <w:rPr>
+                <w:lang w:eastAsia="ko-KR"/>
+              </w:rPr>
+              <w:t>gqvd</w:t>
+            </w:r>
+            <w:r>
+              <w:rPr>
+                <w:lang w:eastAsia="ko-KR"/>
+              </w:rPr>
+              <w:t>}}</w:t>
+            </w:r>
+          </w:p>
+        </w:tc>
+        <w:tc>
+          <w:tcPr>
+            <w:tcW w:w="0" w:type="auto"/>
+          </w:tcPr>
+          <w:p>
+            <w:pPr>
+              <w:pStyle w:val="NoSpacing"/>
+              <w:rPr>
+                <w:lang w:val="vi-VN" w:eastAsia="ko-KR"/>
+              </w:rPr>
+            </w:pPr>
+            <w:r>
+              <w:rPr>
+                <w:lang w:val="vi-VN" w:eastAsia="ko-KR"/>
+              </w:rPr>
+              <w:t>Giải quyết vấn đề</w:t>
+            </w:r>
+          </w:p>
+        </w:tc>
+        <w:tc>
+          <w:tcPr>
+            <w:tcW w:w="0" w:type="auto"/>
+            <w:vAlign w:val="center"/>
+          </w:tcPr>
+          <w:p>
+            <w:pPr>
+              <w:pStyle w:val="NoSpacing"/>
+              <w:rPr>
+                <w:lang w:eastAsia="ko-KR"/>
+              </w:rPr>
+            </w:pPr>
+            <w:r>
+              <w:t>{{ gqvd_cb }}</w:t>
+            </w:r>
+          </w:p>
+        </w:tc>
+        <w:tc>
+          <w:tcPr>
+            <w:tcW w:w="0" w:type="auto"/>
+            <w:vAlign w:val="center"/>
+          </w:tcPr>
+          <w:p>
+            <w:pPr>
+              <w:pStyle w:val="NoSpacing"/>
+              <w:rPr>
+                <w:lang w:eastAsia="ko-KR"/>
+              </w:rPr>
+            </w:pPr>
+            <w:r>
+              <w:t>{{ gqvd_tb }}</w:t>
+            </w:r>
+          </w:p>
+        </w:tc>
+        <w:tc>
+          <w:tcPr>
+            <w:tcW w:w="0" w:type="auto"/>
+            <w:vAlign w:val="center"/>
+          </w:tcPr>
+          <w:p>
+            <w:pPr>
+              <w:pStyle w:val="NoSpacing"/>
+              <w:rPr>
+                <w:lang w:eastAsia="ko-KR"/>
+              </w:rPr>
+            </w:pPr>
+            <w:r>
+              <w:t>{{ gqvd_tot }}</w:t>
+            </w:r>
+          </w:p>
+        </w:tc>
+      </w:tr>
+      <w:tr>
+        <w:tc>
+          <w:tcPr>
+            <w:tcW w:w="0" w:type="auto"/>
+            <w:vAlign w:val="center"/>
+          </w:tcPr>
+          <w:p>
+            <w:pPr>
+              <w:pStyle w:val="NoSpacing"/>
+              <w:rPr>
+                <w:lang w:eastAsia="ko-KR"/>
+              </w:rPr>
+            </w:pPr>
+            <w:r>
+              <w:rPr>
+                <w:lang w:eastAsia="ko-KR"/>
+              </w:rPr>
+              <w:t>{{thvp}}</w:t>
+            </w:r>
+          </w:p>
+        </w:tc>
+        <w:tc>
+          <w:tcPr>
+            <w:tcW w:w="0" w:type="auto"/>
+          </w:tcPr>
+          <w:p>
+            <w:pPr>
+              <w:pStyle w:val="NoSpacing"/>
+              <w:rPr>
+                <w:lang w:val="vi-VN" w:eastAsia="ko-KR"/>
+              </w:rPr>
+            </w:pPr>
+            <w:r>
+              <w:rPr>
+                <w:lang w:eastAsia="ko-KR"/>
+              </w:rPr>
+              <w:t>Tin học</w:t>
+            </w:r>
+            <w:r>
+              <w:rPr>
+                <w:lang w:val="vi-VN" w:eastAsia="ko-KR"/>
+              </w:rPr>
+              <w:t xml:space="preserve"> văn phòng</w:t>
+            </w:r>
+          </w:p>
+        </w:tc>
+        <w:tc>
+          <w:tcPr>
+            <w:tcW w:w="0" w:type="auto"/>
+            <w:vAlign w:val="center"/>
+          </w:tcPr>
+          <w:p>
+            <w:pPr>
+              <w:pStyle w:val="NoSpacing"/>
+            </w:pPr>
+            <w:r>
+              <w:t>{{ thvp_cb }}</w:t>
+            </w:r>
+          </w:p>
+        </w:tc>
+        <w:tc>
+          <w:tcPr>
+            <w:tcW w:w="0" w:type="auto"/>
+            <w:vAlign w:val="center"/>
+          </w:tcPr>
+          <w:p>
+            <w:pPr>
+              <w:pStyle w:val="NoSpacing"/>
+            </w:pPr>
+            <w:r>
+              <w:t>{{ thvp_tb }}</w:t>
+            </w:r>
+          </w:p>
+        </w:tc>
+        <w:tc>
+          <w:tcPr>
+            <w:tcW w:w="0" w:type="auto"/>
+            <w:vAlign w:val="center"/>
+          </w:tcPr>
+          <w:p>
+            <w:pPr>
+              <w:pStyle w:val="NoSpacing"/>
+            </w:pPr>
+            <w:r>
+              <w:t>{{ thvp_tot }}</w:t>
+            </w:r>
+          </w:p>
+        </w:tc>
+      </w:tr>
+      <w:tr>
+        <w:tc>
+          <w:tcPr>
+            <w:tcW w:w="0" w:type="auto"/>
+            <w:vAlign w:val="center"/>
+          </w:tcPr>
+          <w:p>
+            <w:pPr>
+              <w:pStyle w:val="NoSpacing"/>
+              <w:rPr>
+                <w:lang w:val="vi-VN" w:eastAsia="ko-KR"/>
+              </w:rPr>
+            </w:pPr>
+          </w:p>
+        </w:tc>
+        <w:tc>
+          <w:tcPr>
+            <w:tcW w:w="0" w:type="auto"/>
+            <w:vAlign w:val="center"/>
+          </w:tcPr>
+          <w:p>
+            <w:pPr>
+              <w:pStyle w:val="NoSpacing"/>
               <w:rPr>
                 <w:rFonts w:cs="Times New Roman"/>
                 <w:lang w:val="vi-VN" w:eastAsia="ko-KR"/>
               </w:rPr>
             </w:pPr>
-            <w:sdt>
-              <w:sdtPr>
-                <w:rPr>
-                  <w:lang w:val="vi-VN" w:eastAsia="ko-KR"/>
-                </w:rPr>
-                <w:id w:val="1674758511"/>
-                <w14:checkbox>
-                  <w14:checked w14:val="0"/>
-                  <w14:checkedState w14:val="2612" w14:font="MS Gothic"/>
-                  <w14:uncheckedState w14:val="2610" w14:font="MS Gothic"/>
-                </w14:checkbox>
-              </w:sdtPr>
-              <w:sdtContent>
-                <w:r>
-                  <w:rPr>
-                    <w:rFonts w:ascii="MS Gothic" w:eastAsia="MS Gothic" w:hAnsi="MS Gothic" w:hint="eastAsia"/>
-                    <w:lang w:val="vi-VN" w:eastAsia="ko-KR"/>
-                  </w:rPr>
-                  <w:t>☐</w:t>
-                </w:r>
-              </w:sdtContent>
-            </w:sdt>
-          </w:p>
-        </w:tc>
-        <w:tc>
-          <w:tcPr>
-            <w:tcW w:w="0" w:type="auto"/>
-          </w:tcPr>
-          <w:p>
-            <w:pPr>
-              <w:spacing w:before="60" w:after="60"/>
-              <w:jc w:val="left"/>
+            <w:r>
+              <w:rPr>
+                <w:rFonts w:cs="Times New Roman"/>
+                <w:lang w:eastAsia="ko-KR"/>
+              </w:rPr>
+              <w:t>Khác:</w:t>
+            </w:r>
+            <w:r>
               <w:rPr>
                 <w:rFonts w:cs="Times New Roman"/>
                 <w:lang w:val="vi-VN" w:eastAsia="ko-KR"/>
               </w:rPr>
-            </w:pPr>
-            <w:r>
-              <w:rPr>
-                <w:rFonts w:cs="Times New Roman"/>
-                <w:sz w:val="26"/>
-                <w:szCs w:val="26"/>
-                <w:lang w:val="vi-VN" w:eastAsia="ko-KR"/>
-              </w:rPr>
-              <w:t>Giao tiếp</w:t>
+              <w:t xml:space="preserve"> </w:t>
+            </w:r>
+            <w:r>
+              <w:t>{{ SoftSkill_Khac_Check }}</w:t>
             </w:r>
           </w:p>
         </w:tc>
@@ -2758,35 +3024,11 @@
           </w:tcPr>
           <w:p>
             <w:pPr>
-              <w:spacing w:before="60" w:after="60"/>
-              <w:jc w:val="center"/>
-              <w:rPr>
-                <w:rFonts w:cs="Times New Roman"/>
+              <w:pStyle w:val="NoSpacing"/>
+              <w:rPr>
                 <w:lang w:eastAsia="ko-KR"/>
               </w:rPr>
             </w:pPr>
-            <w:sdt>
-              <w:sdtPr>
-                <w:rPr>
-                  <w:lang w:val="vi-VN" w:eastAsia="ko-KR"/>
-                </w:rPr>
-                <w:id w:val="-1737630693"/>
-                <w14:checkbox>
-                  <w14:checked w14:val="0"/>
-                  <w14:checkedState w14:val="2612" w14:font="MS Gothic"/>
-                  <w14:uncheckedState w14:val="2610" w14:font="MS Gothic"/>
-                </w14:checkbox>
-              </w:sdtPr>
-              <w:sdtContent>
-                <w:r>
-                  <w:rPr>
-                    <w:rFonts w:ascii="MS Gothic" w:eastAsia="MS Gothic" w:hAnsi="MS Gothic" w:hint="eastAsia"/>
-                    <w:lang w:val="vi-VN" w:eastAsia="ko-KR"/>
-                  </w:rPr>
-                  <w:t>☐</w:t>
-                </w:r>
-              </w:sdtContent>
-            </w:sdt>
           </w:p>
         </w:tc>
         <w:tc>
@@ -2796,35 +3038,11 @@
           </w:tcPr>
           <w:p>
             <w:pPr>
-              <w:spacing w:before="60" w:after="60"/>
-              <w:jc w:val="center"/>
-              <w:rPr>
-                <w:rFonts w:cs="Times New Roman"/>
+              <w:pStyle w:val="NoSpacing"/>
+              <w:rPr>
                 <w:lang w:eastAsia="ko-KR"/>
               </w:rPr>
             </w:pPr>
-            <w:sdt>
-              <w:sdtPr>
-                <w:rPr>
-                  <w:lang w:val="vi-VN" w:eastAsia="ko-KR"/>
-                </w:rPr>
-                <w:id w:val="1676767746"/>
-                <w14:checkbox>
-                  <w14:checked w14:val="0"/>
-                  <w14:checkedState w14:val="2612" w14:font="MS Gothic"/>
-                  <w14:uncheckedState w14:val="2610" w14:font="MS Gothic"/>
-                </w14:checkbox>
-              </w:sdtPr>
-              <w:sdtContent>
-                <w:r>
-                  <w:rPr>
-                    <w:rFonts w:ascii="MS Gothic" w:eastAsia="MS Gothic" w:hAnsi="MS Gothic" w:hint="eastAsia"/>
-                    <w:lang w:val="vi-VN" w:eastAsia="ko-KR"/>
-                  </w:rPr>
-                  <w:t>☐</w:t>
-                </w:r>
-              </w:sdtContent>
-            </w:sdt>
           </w:p>
         </w:tc>
         <w:tc>
@@ -2834,943 +3052,11 @@
           </w:tcPr>
           <w:p>
             <w:pPr>
-              <w:spacing w:before="60" w:after="60"/>
-              <w:jc w:val="center"/>
-              <w:rPr>
-                <w:rFonts w:cs="Times New Roman"/>
+              <w:pStyle w:val="NoSpacing"/>
+              <w:rPr>
                 <w:lang w:eastAsia="ko-KR"/>
               </w:rPr>
             </w:pPr>
-            <w:sdt>
-              <w:sdtPr>
-                <w:rPr>
-                  <w:lang w:val="vi-VN" w:eastAsia="ko-KR"/>
-                </w:rPr>
-                <w:id w:val="314462412"/>
-                <w14:checkbox>
-                  <w14:checked w14:val="0"/>
-                  <w14:checkedState w14:val="2612" w14:font="MS Gothic"/>
-                  <w14:uncheckedState w14:val="2610" w14:font="MS Gothic"/>
-                </w14:checkbox>
-              </w:sdtPr>
-              <w:sdtContent>
-                <w:r>
-                  <w:rPr>
-                    <w:rFonts w:ascii="MS Gothic" w:eastAsia="MS Gothic" w:hAnsi="MS Gothic" w:hint="eastAsia"/>
-                    <w:lang w:val="vi-VN" w:eastAsia="ko-KR"/>
-                  </w:rPr>
-                  <w:t>☐</w:t>
-                </w:r>
-              </w:sdtContent>
-            </w:sdt>
-          </w:p>
-        </w:tc>
-      </w:tr>
-      <w:tr>
-        <w:tc>
-          <w:tcPr>
-            <w:tcW w:w="0" w:type="auto"/>
-            <w:vAlign w:val="center"/>
-          </w:tcPr>
-          <w:p>
-            <w:pPr>
-              <w:spacing w:before="60" w:after="60"/>
-              <w:jc w:val="center"/>
-              <w:rPr>
-                <w:rFonts w:cs="Times New Roman"/>
-                <w:lang w:val="vi-VN" w:eastAsia="ko-KR"/>
-              </w:rPr>
-            </w:pPr>
-            <w:sdt>
-              <w:sdtPr>
-                <w:rPr>
-                  <w:lang w:val="vi-VN" w:eastAsia="ko-KR"/>
-                </w:rPr>
-                <w:id w:val="-410012277"/>
-                <w14:checkbox>
-                  <w14:checked w14:val="0"/>
-                  <w14:checkedState w14:val="2612" w14:font="MS Gothic"/>
-                  <w14:uncheckedState w14:val="2610" w14:font="MS Gothic"/>
-                </w14:checkbox>
-              </w:sdtPr>
-              <w:sdtContent>
-                <w:r>
-                  <w:rPr>
-                    <w:rFonts w:ascii="MS Gothic" w:eastAsia="MS Gothic" w:hAnsi="MS Gothic" w:hint="eastAsia"/>
-                    <w:lang w:val="vi-VN" w:eastAsia="ko-KR"/>
-                  </w:rPr>
-                  <w:t>☐</w:t>
-                </w:r>
-              </w:sdtContent>
-            </w:sdt>
-          </w:p>
-        </w:tc>
-        <w:tc>
-          <w:tcPr>
-            <w:tcW w:w="0" w:type="auto"/>
-          </w:tcPr>
-          <w:p>
-            <w:pPr>
-              <w:spacing w:before="60" w:after="60"/>
-              <w:jc w:val="left"/>
-              <w:rPr>
-                <w:rFonts w:cs="Times New Roman"/>
-                <w:lang w:val="vi-VN" w:eastAsia="ko-KR"/>
-              </w:rPr>
-            </w:pPr>
-            <w:r>
-              <w:rPr>
-                <w:rFonts w:cs="Times New Roman"/>
-                <w:sz w:val="26"/>
-                <w:szCs w:val="26"/>
-                <w:lang w:val="vi-VN" w:eastAsia="ko-KR"/>
-              </w:rPr>
-              <w:t>Làm việc nhóm</w:t>
-            </w:r>
-          </w:p>
-        </w:tc>
-        <w:tc>
-          <w:tcPr>
-            <w:tcW w:w="0" w:type="auto"/>
-            <w:vAlign w:val="center"/>
-          </w:tcPr>
-          <w:p>
-            <w:pPr>
-              <w:spacing w:before="60" w:after="60"/>
-              <w:jc w:val="center"/>
-              <w:rPr>
-                <w:rFonts w:cs="Times New Roman"/>
-                <w:lang w:eastAsia="ko-KR"/>
-              </w:rPr>
-            </w:pPr>
-            <w:sdt>
-              <w:sdtPr>
-                <w:rPr>
-                  <w:lang w:val="vi-VN" w:eastAsia="ko-KR"/>
-                </w:rPr>
-                <w:id w:val="-37278888"/>
-                <w14:checkbox>
-                  <w14:checked w14:val="0"/>
-                  <w14:checkedState w14:val="2612" w14:font="MS Gothic"/>
-                  <w14:uncheckedState w14:val="2610" w14:font="MS Gothic"/>
-                </w14:checkbox>
-              </w:sdtPr>
-              <w:sdtContent>
-                <w:r>
-                  <w:rPr>
-                    <w:rFonts w:ascii="MS Gothic" w:eastAsia="MS Gothic" w:hAnsi="MS Gothic" w:hint="eastAsia"/>
-                    <w:lang w:val="vi-VN" w:eastAsia="ko-KR"/>
-                  </w:rPr>
-                  <w:t>☐</w:t>
-                </w:r>
-              </w:sdtContent>
-            </w:sdt>
-          </w:p>
-        </w:tc>
-        <w:tc>
-          <w:tcPr>
-            <w:tcW w:w="0" w:type="auto"/>
-            <w:vAlign w:val="center"/>
-          </w:tcPr>
-          <w:p>
-            <w:pPr>
-              <w:spacing w:before="60" w:after="60"/>
-              <w:jc w:val="center"/>
-              <w:rPr>
-                <w:rFonts w:cs="Times New Roman"/>
-                <w:lang w:eastAsia="ko-KR"/>
-              </w:rPr>
-            </w:pPr>
-            <w:sdt>
-              <w:sdtPr>
-                <w:rPr>
-                  <w:lang w:val="vi-VN" w:eastAsia="ko-KR"/>
-                </w:rPr>
-                <w:id w:val="717479077"/>
-                <w14:checkbox>
-                  <w14:checked w14:val="0"/>
-                  <w14:checkedState w14:val="2612" w14:font="MS Gothic"/>
-                  <w14:uncheckedState w14:val="2610" w14:font="MS Gothic"/>
-                </w14:checkbox>
-              </w:sdtPr>
-              <w:sdtContent>
-                <w:r>
-                  <w:rPr>
-                    <w:rFonts w:ascii="MS Gothic" w:eastAsia="MS Gothic" w:hAnsi="MS Gothic" w:hint="eastAsia"/>
-                    <w:lang w:val="vi-VN" w:eastAsia="ko-KR"/>
-                  </w:rPr>
-                  <w:t>☐</w:t>
-                </w:r>
-              </w:sdtContent>
-            </w:sdt>
-          </w:p>
-        </w:tc>
-        <w:tc>
-          <w:tcPr>
-            <w:tcW w:w="0" w:type="auto"/>
-            <w:vAlign w:val="center"/>
-          </w:tcPr>
-          <w:p>
-            <w:pPr>
-              <w:spacing w:before="60" w:after="60"/>
-              <w:jc w:val="center"/>
-              <w:rPr>
-                <w:rFonts w:cs="Times New Roman"/>
-                <w:lang w:eastAsia="ko-KR"/>
-              </w:rPr>
-            </w:pPr>
-            <w:sdt>
-              <w:sdtPr>
-                <w:rPr>
-                  <w:lang w:val="vi-VN" w:eastAsia="ko-KR"/>
-                </w:rPr>
-                <w:id w:val="124430084"/>
-                <w14:checkbox>
-                  <w14:checked w14:val="0"/>
-                  <w14:checkedState w14:val="2612" w14:font="MS Gothic"/>
-                  <w14:uncheckedState w14:val="2610" w14:font="MS Gothic"/>
-                </w14:checkbox>
-              </w:sdtPr>
-              <w:sdtContent>
-                <w:r>
-                  <w:rPr>
-                    <w:rFonts w:ascii="MS Gothic" w:eastAsia="MS Gothic" w:hAnsi="MS Gothic" w:hint="eastAsia"/>
-                    <w:lang w:val="vi-VN" w:eastAsia="ko-KR"/>
-                  </w:rPr>
-                  <w:t>☐</w:t>
-                </w:r>
-              </w:sdtContent>
-            </w:sdt>
-          </w:p>
-        </w:tc>
-      </w:tr>
-      <w:tr>
-        <w:tc>
-          <w:tcPr>
-            <w:tcW w:w="0" w:type="auto"/>
-            <w:vAlign w:val="center"/>
-          </w:tcPr>
-          <w:p>
-            <w:pPr>
-              <w:spacing w:before="60" w:after="60"/>
-              <w:jc w:val="center"/>
-              <w:rPr>
-                <w:rFonts w:cs="Times New Roman"/>
-                <w:lang w:val="vi-VN" w:eastAsia="ko-KR"/>
-              </w:rPr>
-            </w:pPr>
-            <w:sdt>
-              <w:sdtPr>
-                <w:rPr>
-                  <w:lang w:val="vi-VN" w:eastAsia="ko-KR"/>
-                </w:rPr>
-                <w:id w:val="-1693755142"/>
-                <w14:checkbox>
-                  <w14:checked w14:val="0"/>
-                  <w14:checkedState w14:val="2612" w14:font="MS Gothic"/>
-                  <w14:uncheckedState w14:val="2610" w14:font="MS Gothic"/>
-                </w14:checkbox>
-              </w:sdtPr>
-              <w:sdtContent>
-                <w:r>
-                  <w:rPr>
-                    <w:rFonts w:ascii="MS Gothic" w:eastAsia="MS Gothic" w:hAnsi="MS Gothic" w:hint="eastAsia"/>
-                    <w:lang w:val="vi-VN" w:eastAsia="ko-KR"/>
-                  </w:rPr>
-                  <w:t>☐</w:t>
-                </w:r>
-              </w:sdtContent>
-            </w:sdt>
-          </w:p>
-        </w:tc>
-        <w:tc>
-          <w:tcPr>
-            <w:tcW w:w="0" w:type="auto"/>
-          </w:tcPr>
-          <w:p>
-            <w:pPr>
-              <w:spacing w:before="60" w:after="60"/>
-              <w:jc w:val="left"/>
-              <w:rPr>
-                <w:rFonts w:cs="Times New Roman"/>
-                <w:lang w:val="vi-VN" w:eastAsia="ko-KR"/>
-              </w:rPr>
-            </w:pPr>
-            <w:r>
-              <w:rPr>
-                <w:rFonts w:cs="Times New Roman"/>
-                <w:sz w:val="26"/>
-                <w:szCs w:val="26"/>
-                <w:lang w:val="vi-VN" w:eastAsia="ko-KR"/>
-              </w:rPr>
-              <w:t>Quản lý thời gian</w:t>
-            </w:r>
-          </w:p>
-        </w:tc>
-        <w:tc>
-          <w:tcPr>
-            <w:tcW w:w="0" w:type="auto"/>
-            <w:vAlign w:val="center"/>
-          </w:tcPr>
-          <w:p>
-            <w:pPr>
-              <w:spacing w:before="60" w:after="60"/>
-              <w:jc w:val="center"/>
-              <w:rPr>
-                <w:rFonts w:cs="Times New Roman"/>
-                <w:lang w:eastAsia="ko-KR"/>
-              </w:rPr>
-            </w:pPr>
-            <w:sdt>
-              <w:sdtPr>
-                <w:rPr>
-                  <w:lang w:val="vi-VN" w:eastAsia="ko-KR"/>
-                </w:rPr>
-                <w:id w:val="-1007745823"/>
-                <w14:checkbox>
-                  <w14:checked w14:val="0"/>
-                  <w14:checkedState w14:val="2612" w14:font="MS Gothic"/>
-                  <w14:uncheckedState w14:val="2610" w14:font="MS Gothic"/>
-                </w14:checkbox>
-              </w:sdtPr>
-              <w:sdtContent>
-                <w:r>
-                  <w:rPr>
-                    <w:rFonts w:ascii="MS Gothic" w:eastAsia="MS Gothic" w:hAnsi="MS Gothic" w:hint="eastAsia"/>
-                    <w:lang w:val="vi-VN" w:eastAsia="ko-KR"/>
-                  </w:rPr>
-                  <w:t>☐</w:t>
-                </w:r>
-              </w:sdtContent>
-            </w:sdt>
-          </w:p>
-        </w:tc>
-        <w:tc>
-          <w:tcPr>
-            <w:tcW w:w="0" w:type="auto"/>
-            <w:vAlign w:val="center"/>
-          </w:tcPr>
-          <w:p>
-            <w:pPr>
-              <w:spacing w:before="60" w:after="60"/>
-              <w:jc w:val="center"/>
-              <w:rPr>
-                <w:rFonts w:cs="Times New Roman"/>
-                <w:lang w:eastAsia="ko-KR"/>
-              </w:rPr>
-            </w:pPr>
-            <w:sdt>
-              <w:sdtPr>
-                <w:rPr>
-                  <w:lang w:val="vi-VN" w:eastAsia="ko-KR"/>
-                </w:rPr>
-                <w:id w:val="1671299492"/>
-                <w14:checkbox>
-                  <w14:checked w14:val="0"/>
-                  <w14:checkedState w14:val="2612" w14:font="MS Gothic"/>
-                  <w14:uncheckedState w14:val="2610" w14:font="MS Gothic"/>
-                </w14:checkbox>
-              </w:sdtPr>
-              <w:sdtContent>
-                <w:r>
-                  <w:rPr>
-                    <w:rFonts w:ascii="MS Gothic" w:eastAsia="MS Gothic" w:hAnsi="MS Gothic" w:hint="eastAsia"/>
-                    <w:lang w:val="vi-VN" w:eastAsia="ko-KR"/>
-                  </w:rPr>
-                  <w:t>☐</w:t>
-                </w:r>
-              </w:sdtContent>
-            </w:sdt>
-          </w:p>
-        </w:tc>
-        <w:tc>
-          <w:tcPr>
-            <w:tcW w:w="0" w:type="auto"/>
-            <w:vAlign w:val="center"/>
-          </w:tcPr>
-          <w:p>
-            <w:pPr>
-              <w:spacing w:before="60" w:after="60"/>
-              <w:jc w:val="center"/>
-              <w:rPr>
-                <w:rFonts w:cs="Times New Roman"/>
-                <w:lang w:eastAsia="ko-KR"/>
-              </w:rPr>
-            </w:pPr>
-            <w:sdt>
-              <w:sdtPr>
-                <w:rPr>
-                  <w:lang w:val="vi-VN" w:eastAsia="ko-KR"/>
-                </w:rPr>
-                <w:id w:val="1219707019"/>
-                <w14:checkbox>
-                  <w14:checked w14:val="0"/>
-                  <w14:checkedState w14:val="2612" w14:font="MS Gothic"/>
-                  <w14:uncheckedState w14:val="2610" w14:font="MS Gothic"/>
-                </w14:checkbox>
-              </w:sdtPr>
-              <w:sdtContent>
-                <w:r>
-                  <w:rPr>
-                    <w:rFonts w:ascii="MS Gothic" w:eastAsia="MS Gothic" w:hAnsi="MS Gothic" w:hint="eastAsia"/>
-                    <w:lang w:val="vi-VN" w:eastAsia="ko-KR"/>
-                  </w:rPr>
-                  <w:t>☐</w:t>
-                </w:r>
-              </w:sdtContent>
-            </w:sdt>
-          </w:p>
-        </w:tc>
-      </w:tr>
-      <w:tr>
-        <w:tc>
-          <w:tcPr>
-            <w:tcW w:w="0" w:type="auto"/>
-            <w:vAlign w:val="center"/>
-          </w:tcPr>
-          <w:p>
-            <w:pPr>
-              <w:spacing w:before="60" w:after="60"/>
-              <w:jc w:val="center"/>
-              <w:rPr>
-                <w:rFonts w:cs="Times New Roman"/>
-                <w:lang w:val="vi-VN" w:eastAsia="ko-KR"/>
-              </w:rPr>
-            </w:pPr>
-            <w:sdt>
-              <w:sdtPr>
-                <w:rPr>
-                  <w:lang w:val="vi-VN" w:eastAsia="ko-KR"/>
-                </w:rPr>
-                <w:id w:val="1469710339"/>
-                <w14:checkbox>
-                  <w14:checked w14:val="0"/>
-                  <w14:checkedState w14:val="2612" w14:font="MS Gothic"/>
-                  <w14:uncheckedState w14:val="2610" w14:font="MS Gothic"/>
-                </w14:checkbox>
-              </w:sdtPr>
-              <w:sdtContent>
-                <w:r>
-                  <w:rPr>
-                    <w:rFonts w:ascii="MS Gothic" w:eastAsia="MS Gothic" w:hAnsi="MS Gothic" w:hint="eastAsia"/>
-                    <w:lang w:val="vi-VN" w:eastAsia="ko-KR"/>
-                  </w:rPr>
-                  <w:t>☐</w:t>
-                </w:r>
-              </w:sdtContent>
-            </w:sdt>
-          </w:p>
-        </w:tc>
-        <w:tc>
-          <w:tcPr>
-            <w:tcW w:w="0" w:type="auto"/>
-          </w:tcPr>
-          <w:p>
-            <w:pPr>
-              <w:spacing w:before="60" w:after="60"/>
-              <w:jc w:val="left"/>
-              <w:rPr>
-                <w:rFonts w:cs="Times New Roman"/>
-                <w:lang w:val="vi-VN" w:eastAsia="ko-KR"/>
-              </w:rPr>
-            </w:pPr>
-            <w:r>
-              <w:rPr>
-                <w:rFonts w:cs="Times New Roman"/>
-                <w:sz w:val="26"/>
-                <w:szCs w:val="26"/>
-                <w:lang w:val="vi-VN" w:eastAsia="ko-KR"/>
-              </w:rPr>
-              <w:t>Sáng tạo</w:t>
-            </w:r>
-          </w:p>
-        </w:tc>
-        <w:tc>
-          <w:tcPr>
-            <w:tcW w:w="0" w:type="auto"/>
-            <w:vAlign w:val="center"/>
-          </w:tcPr>
-          <w:p>
-            <w:pPr>
-              <w:spacing w:before="60" w:after="60"/>
-              <w:jc w:val="center"/>
-              <w:rPr>
-                <w:rFonts w:cs="Times New Roman"/>
-                <w:lang w:eastAsia="ko-KR"/>
-              </w:rPr>
-            </w:pPr>
-            <w:sdt>
-              <w:sdtPr>
-                <w:rPr>
-                  <w:lang w:val="vi-VN" w:eastAsia="ko-KR"/>
-                </w:rPr>
-                <w:id w:val="-942147201"/>
-                <w14:checkbox>
-                  <w14:checked w14:val="0"/>
-                  <w14:checkedState w14:val="2612" w14:font="MS Gothic"/>
-                  <w14:uncheckedState w14:val="2610" w14:font="MS Gothic"/>
-                </w14:checkbox>
-              </w:sdtPr>
-              <w:sdtContent>
-                <w:r>
-                  <w:rPr>
-                    <w:rFonts w:ascii="MS Gothic" w:eastAsia="MS Gothic" w:hAnsi="MS Gothic" w:hint="eastAsia"/>
-                    <w:lang w:val="vi-VN" w:eastAsia="ko-KR"/>
-                  </w:rPr>
-                  <w:t>☐</w:t>
-                </w:r>
-              </w:sdtContent>
-            </w:sdt>
-          </w:p>
-        </w:tc>
-        <w:tc>
-          <w:tcPr>
-            <w:tcW w:w="0" w:type="auto"/>
-            <w:vAlign w:val="center"/>
-          </w:tcPr>
-          <w:p>
-            <w:pPr>
-              <w:spacing w:before="60" w:after="60"/>
-              <w:jc w:val="center"/>
-              <w:rPr>
-                <w:rFonts w:cs="Times New Roman"/>
-                <w:lang w:eastAsia="ko-KR"/>
-              </w:rPr>
-            </w:pPr>
-            <w:sdt>
-              <w:sdtPr>
-                <w:rPr>
-                  <w:lang w:val="vi-VN" w:eastAsia="ko-KR"/>
-                </w:rPr>
-                <w:id w:val="-451934250"/>
-                <w14:checkbox>
-                  <w14:checked w14:val="0"/>
-                  <w14:checkedState w14:val="2612" w14:font="MS Gothic"/>
-                  <w14:uncheckedState w14:val="2610" w14:font="MS Gothic"/>
-                </w14:checkbox>
-              </w:sdtPr>
-              <w:sdtContent>
-                <w:r>
-                  <w:rPr>
-                    <w:rFonts w:ascii="MS Gothic" w:eastAsia="MS Gothic" w:hAnsi="MS Gothic" w:hint="eastAsia"/>
-                    <w:lang w:val="vi-VN" w:eastAsia="ko-KR"/>
-                  </w:rPr>
-                  <w:t>☐</w:t>
-                </w:r>
-              </w:sdtContent>
-            </w:sdt>
-          </w:p>
-        </w:tc>
-        <w:tc>
-          <w:tcPr>
-            <w:tcW w:w="0" w:type="auto"/>
-            <w:vAlign w:val="center"/>
-          </w:tcPr>
-          <w:p>
-            <w:pPr>
-              <w:spacing w:before="60" w:after="60"/>
-              <w:jc w:val="center"/>
-              <w:rPr>
-                <w:rFonts w:cs="Times New Roman"/>
-                <w:lang w:eastAsia="ko-KR"/>
-              </w:rPr>
-            </w:pPr>
-            <w:sdt>
-              <w:sdtPr>
-                <w:rPr>
-                  <w:lang w:val="vi-VN" w:eastAsia="ko-KR"/>
-                </w:rPr>
-                <w:id w:val="-110758103"/>
-                <w14:checkbox>
-                  <w14:checked w14:val="0"/>
-                  <w14:checkedState w14:val="2612" w14:font="MS Gothic"/>
-                  <w14:uncheckedState w14:val="2610" w14:font="MS Gothic"/>
-                </w14:checkbox>
-              </w:sdtPr>
-              <w:sdtContent>
-                <w:r>
-                  <w:rPr>
-                    <w:rFonts w:ascii="MS Gothic" w:eastAsia="MS Gothic" w:hAnsi="MS Gothic" w:hint="eastAsia"/>
-                    <w:lang w:val="vi-VN" w:eastAsia="ko-KR"/>
-                  </w:rPr>
-                  <w:t>☐</w:t>
-                </w:r>
-              </w:sdtContent>
-            </w:sdt>
-          </w:p>
-        </w:tc>
-      </w:tr>
-      <w:tr>
-        <w:tc>
-          <w:tcPr>
-            <w:tcW w:w="0" w:type="auto"/>
-            <w:vAlign w:val="center"/>
-          </w:tcPr>
-          <w:p>
-            <w:pPr>
-              <w:spacing w:before="60" w:after="60"/>
-              <w:jc w:val="center"/>
-              <w:rPr>
-                <w:rFonts w:cs="Times New Roman"/>
-                <w:lang w:val="vi-VN" w:eastAsia="ko-KR"/>
-              </w:rPr>
-            </w:pPr>
-            <w:sdt>
-              <w:sdtPr>
-                <w:rPr>
-                  <w:lang w:val="vi-VN" w:eastAsia="ko-KR"/>
-                </w:rPr>
-                <w:id w:val="1023368303"/>
-                <w14:checkbox>
-                  <w14:checked w14:val="0"/>
-                  <w14:checkedState w14:val="2612" w14:font="MS Gothic"/>
-                  <w14:uncheckedState w14:val="2610" w14:font="MS Gothic"/>
-                </w14:checkbox>
-              </w:sdtPr>
-              <w:sdtContent>
-                <w:r>
-                  <w:rPr>
-                    <w:rFonts w:ascii="MS Gothic" w:eastAsia="MS Gothic" w:hAnsi="MS Gothic" w:hint="eastAsia"/>
-                    <w:lang w:val="vi-VN" w:eastAsia="ko-KR"/>
-                  </w:rPr>
-                  <w:t>☐</w:t>
-                </w:r>
-              </w:sdtContent>
-            </w:sdt>
-          </w:p>
-        </w:tc>
-        <w:tc>
-          <w:tcPr>
-            <w:tcW w:w="0" w:type="auto"/>
-          </w:tcPr>
-          <w:p>
-            <w:pPr>
-              <w:spacing w:before="60" w:after="60"/>
-              <w:jc w:val="left"/>
-              <w:rPr>
-                <w:rFonts w:cs="Times New Roman"/>
-                <w:lang w:val="vi-VN" w:eastAsia="ko-KR"/>
-              </w:rPr>
-            </w:pPr>
-            <w:r>
-              <w:rPr>
-                <w:rFonts w:cs="Times New Roman"/>
-                <w:sz w:val="26"/>
-                <w:szCs w:val="26"/>
-                <w:lang w:val="vi-VN" w:eastAsia="ko-KR"/>
-              </w:rPr>
-              <w:t>Giải quyết vấn đề</w:t>
-            </w:r>
-          </w:p>
-        </w:tc>
-        <w:tc>
-          <w:tcPr>
-            <w:tcW w:w="0" w:type="auto"/>
-            <w:vAlign w:val="center"/>
-          </w:tcPr>
-          <w:p>
-            <w:pPr>
-              <w:spacing w:before="60" w:after="60"/>
-              <w:jc w:val="center"/>
-              <w:rPr>
-                <w:rFonts w:cs="Times New Roman"/>
-                <w:lang w:eastAsia="ko-KR"/>
-              </w:rPr>
-            </w:pPr>
-            <w:sdt>
-              <w:sdtPr>
-                <w:rPr>
-                  <w:lang w:val="vi-VN" w:eastAsia="ko-KR"/>
-                </w:rPr>
-                <w:id w:val="1973709800"/>
-                <w14:checkbox>
-                  <w14:checked w14:val="0"/>
-                  <w14:checkedState w14:val="2612" w14:font="MS Gothic"/>
-                  <w14:uncheckedState w14:val="2610" w14:font="MS Gothic"/>
-                </w14:checkbox>
-              </w:sdtPr>
-              <w:sdtContent>
-                <w:r>
-                  <w:rPr>
-                    <w:rFonts w:ascii="MS Gothic" w:eastAsia="MS Gothic" w:hAnsi="MS Gothic" w:hint="eastAsia"/>
-                    <w:lang w:val="vi-VN" w:eastAsia="ko-KR"/>
-                  </w:rPr>
-                  <w:t>☐</w:t>
-                </w:r>
-              </w:sdtContent>
-            </w:sdt>
-          </w:p>
-        </w:tc>
-        <w:tc>
-          <w:tcPr>
-            <w:tcW w:w="0" w:type="auto"/>
-            <w:vAlign w:val="center"/>
-          </w:tcPr>
-          <w:p>
-            <w:pPr>
-              <w:spacing w:before="60" w:after="60"/>
-              <w:jc w:val="center"/>
-              <w:rPr>
-                <w:rFonts w:cs="Times New Roman"/>
-                <w:lang w:eastAsia="ko-KR"/>
-              </w:rPr>
-            </w:pPr>
-            <w:sdt>
-              <w:sdtPr>
-                <w:rPr>
-                  <w:lang w:val="vi-VN" w:eastAsia="ko-KR"/>
-                </w:rPr>
-                <w:id w:val="102389964"/>
-                <w14:checkbox>
-                  <w14:checked w14:val="0"/>
-                  <w14:checkedState w14:val="2612" w14:font="MS Gothic"/>
-                  <w14:uncheckedState w14:val="2610" w14:font="MS Gothic"/>
-                </w14:checkbox>
-              </w:sdtPr>
-              <w:sdtContent>
-                <w:r>
-                  <w:rPr>
-                    <w:rFonts w:ascii="MS Gothic" w:eastAsia="MS Gothic" w:hAnsi="MS Gothic" w:hint="eastAsia"/>
-                    <w:lang w:val="vi-VN" w:eastAsia="ko-KR"/>
-                  </w:rPr>
-                  <w:t>☐</w:t>
-                </w:r>
-              </w:sdtContent>
-            </w:sdt>
-          </w:p>
-        </w:tc>
-        <w:tc>
-          <w:tcPr>
-            <w:tcW w:w="0" w:type="auto"/>
-            <w:vAlign w:val="center"/>
-          </w:tcPr>
-          <w:p>
-            <w:pPr>
-              <w:spacing w:before="60" w:after="60"/>
-              <w:jc w:val="center"/>
-              <w:rPr>
-                <w:rFonts w:cs="Times New Roman"/>
-                <w:lang w:eastAsia="ko-KR"/>
-              </w:rPr>
-            </w:pPr>
-            <w:sdt>
-              <w:sdtPr>
-                <w:rPr>
-                  <w:lang w:val="vi-VN" w:eastAsia="ko-KR"/>
-                </w:rPr>
-                <w:id w:val="-365378376"/>
-                <w14:checkbox>
-                  <w14:checked w14:val="0"/>
-                  <w14:checkedState w14:val="2612" w14:font="MS Gothic"/>
-                  <w14:uncheckedState w14:val="2610" w14:font="MS Gothic"/>
-                </w14:checkbox>
-              </w:sdtPr>
-              <w:sdtContent>
-                <w:r>
-                  <w:rPr>
-                    <w:rFonts w:ascii="MS Gothic" w:eastAsia="MS Gothic" w:hAnsi="MS Gothic" w:hint="eastAsia"/>
-                    <w:lang w:val="vi-VN" w:eastAsia="ko-KR"/>
-                  </w:rPr>
-                  <w:t>☐</w:t>
-                </w:r>
-              </w:sdtContent>
-            </w:sdt>
-          </w:p>
-        </w:tc>
-      </w:tr>
-      <w:tr>
-        <w:tc>
-          <w:tcPr>
-            <w:tcW w:w="0" w:type="auto"/>
-            <w:vAlign w:val="center"/>
-          </w:tcPr>
-          <w:p>
-            <w:pPr>
-              <w:spacing w:before="120"/>
-              <w:jc w:val="center"/>
-              <w:rPr>
-                <w:rFonts w:cs="Times New Roman"/>
-                <w:lang w:val="vi-VN" w:eastAsia="ko-KR"/>
-              </w:rPr>
-            </w:pPr>
-            <w:sdt>
-              <w:sdtPr>
-                <w:rPr>
-                  <w:lang w:val="vi-VN" w:eastAsia="ko-KR"/>
-                </w:rPr>
-                <w:id w:val="1624264959"/>
-                <w14:checkbox>
-                  <w14:checked w14:val="0"/>
-                  <w14:checkedState w14:val="2612" w14:font="MS Gothic"/>
-                  <w14:uncheckedState w14:val="2610" w14:font="MS Gothic"/>
-                </w14:checkbox>
-              </w:sdtPr>
-              <w:sdtContent>
-                <w:r>
-                  <w:rPr>
-                    <w:rFonts w:ascii="MS Gothic" w:eastAsia="MS Gothic" w:hAnsi="MS Gothic" w:hint="eastAsia"/>
-                    <w:lang w:val="vi-VN" w:eastAsia="ko-KR"/>
-                  </w:rPr>
-                  <w:t>☐</w:t>
-                </w:r>
-              </w:sdtContent>
-            </w:sdt>
-          </w:p>
-        </w:tc>
-        <w:tc>
-          <w:tcPr>
-            <w:tcW w:w="0" w:type="auto"/>
-            <w:vAlign w:val="center"/>
-          </w:tcPr>
-          <w:p>
-            <w:pPr>
-              <w:tabs>
-                <w:tab w:val="left" w:leader="dot" w:pos="5387"/>
-              </w:tabs>
-              <w:spacing w:before="120"/>
-              <w:jc w:val="left"/>
-              <w:rPr>
-                <w:rFonts w:cs="Times New Roman"/>
-                <w:lang w:val="vi-VN" w:eastAsia="ko-KR"/>
-              </w:rPr>
-            </w:pPr>
-            <w:r>
-              <w:rPr>
-                <w:rFonts w:cs="Times New Roman"/>
-                <w:lang w:eastAsia="ko-KR"/>
-              </w:rPr>
-              <w:t>Khác:</w:t>
-            </w:r>
-            <w:r>
-              <w:rPr>
-                <w:rFonts w:cs="Times New Roman"/>
-                <w:lang w:val="vi-VN" w:eastAsia="ko-KR"/>
-              </w:rPr>
-              <w:tab/>
-            </w:r>
-          </w:p>
-        </w:tc>
-        <w:tc>
-          <w:tcPr>
-            <w:tcW w:w="0" w:type="auto"/>
-            <w:vAlign w:val="center"/>
-          </w:tcPr>
-          <w:p>
-            <w:pPr>
-              <w:tabs>
-                <w:tab w:val="left" w:leader="dot" w:pos="7150"/>
-              </w:tabs>
-              <w:spacing w:before="120"/>
-              <w:jc w:val="center"/>
-              <w:rPr>
-                <w:rFonts w:cs="Times New Roman"/>
-                <w:lang w:eastAsia="ko-KR"/>
-              </w:rPr>
-            </w:pPr>
-            <w:sdt>
-              <w:sdtPr>
-                <w:rPr>
-                  <w:lang w:val="vi-VN" w:eastAsia="ko-KR"/>
-                </w:rPr>
-                <w:id w:val="-1383394437"/>
-                <w14:checkbox>
-                  <w14:checked w14:val="0"/>
-                  <w14:checkedState w14:val="2612" w14:font="MS Gothic"/>
-                  <w14:uncheckedState w14:val="2610" w14:font="MS Gothic"/>
-                </w14:checkbox>
-              </w:sdtPr>
-              <w:sdtContent>
-                <w:r>
-                  <w:rPr>
-                    <w:rFonts w:ascii="MS Gothic" w:eastAsia="MS Gothic" w:hAnsi="MS Gothic" w:hint="eastAsia"/>
-                    <w:lang w:val="vi-VN" w:eastAsia="ko-KR"/>
-                  </w:rPr>
-                  <w:t>☐</w:t>
-                </w:r>
-              </w:sdtContent>
-            </w:sdt>
-          </w:p>
-        </w:tc>
-        <w:tc>
-          <w:tcPr>
-            <w:tcW w:w="0" w:type="auto"/>
-            <w:vAlign w:val="center"/>
-          </w:tcPr>
-          <w:p>
-            <w:pPr>
-              <w:tabs>
-                <w:tab w:val="left" w:leader="dot" w:pos="7150"/>
-              </w:tabs>
-              <w:spacing w:before="120"/>
-              <w:jc w:val="center"/>
-              <w:rPr>
-                <w:rFonts w:cs="Times New Roman"/>
-                <w:lang w:eastAsia="ko-KR"/>
-              </w:rPr>
-            </w:pPr>
-            <w:sdt>
-              <w:sdtPr>
-                <w:rPr>
-                  <w:lang w:val="vi-VN" w:eastAsia="ko-KR"/>
-                </w:rPr>
-                <w:id w:val="-1637089146"/>
-                <w14:checkbox>
-                  <w14:checked w14:val="0"/>
-                  <w14:checkedState w14:val="2612" w14:font="MS Gothic"/>
-                  <w14:uncheckedState w14:val="2610" w14:font="MS Gothic"/>
-                </w14:checkbox>
-              </w:sdtPr>
-              <w:sdtContent>
-                <w:r>
-                  <w:rPr>
-                    <w:rFonts w:ascii="MS Gothic" w:eastAsia="MS Gothic" w:hAnsi="MS Gothic" w:hint="eastAsia"/>
-                    <w:lang w:val="vi-VN" w:eastAsia="ko-KR"/>
-                  </w:rPr>
-                  <w:t>☐</w:t>
-                </w:r>
-              </w:sdtContent>
-            </w:sdt>
-          </w:p>
-        </w:tc>
-        <w:tc>
-          <w:tcPr>
-            <w:tcW w:w="0" w:type="auto"/>
-            <w:vAlign w:val="center"/>
-          </w:tcPr>
-          <w:p>
-            <w:pPr>
-              <w:tabs>
-                <w:tab w:val="left" w:leader="dot" w:pos="7150"/>
-              </w:tabs>
-              <w:spacing w:before="120"/>
-              <w:jc w:val="center"/>
-              <w:rPr>
-                <w:rFonts w:cs="Times New Roman"/>
-                <w:lang w:eastAsia="ko-KR"/>
-              </w:rPr>
-            </w:pPr>
-            <w:sdt>
-              <w:sdtPr>
-                <w:rPr>
-                  <w:lang w:val="vi-VN" w:eastAsia="ko-KR"/>
-                </w:rPr>
-                <w:id w:val="1646623019"/>
-                <w14:checkbox>
-                  <w14:checked w14:val="0"/>
-                  <w14:checkedState w14:val="2612" w14:font="MS Gothic"/>
-                  <w14:uncheckedState w14:val="2610" w14:font="MS Gothic"/>
-                </w14:checkbox>
-              </w:sdtPr>
-              <w:sdtContent>
-                <w:r>
-                  <w:rPr>
-                    <w:rFonts w:ascii="MS Gothic" w:eastAsia="MS Gothic" w:hAnsi="MS Gothic" w:hint="eastAsia"/>
-                    <w:lang w:val="vi-VN" w:eastAsia="ko-KR"/>
-                  </w:rPr>
-                  <w:t>☐</w:t>
-                </w:r>
-              </w:sdtContent>
-            </w:sdt>
           </w:p>
         </w:tc>
       </w:tr>
@@ -3793,6 +3079,8 @@
         </w:tabs>
         <w:rPr>
           <w:rFonts w:cs="Times New Roman"/>
+          <w:b/>
+          <w:bCs/>
           <w:sz w:val="26"/>
           <w:szCs w:val="26"/>
           <w:lang w:val="vi-VN" w:eastAsia="ko-KR"/>
@@ -3801,6 +3089,8 @@
       <w:r>
         <w:rPr>
           <w:rFonts w:cs="Times New Roman"/>
+          <w:b/>
+          <w:bCs/>
           <w:sz w:val="26"/>
           <w:szCs w:val="26"/>
           <w:lang w:val="vi-VN" w:eastAsia="ko-KR"/>
@@ -3945,26 +3235,19 @@
           <w:rFonts w:cs="Times New Roman"/>
           <w:sz w:val="26"/>
           <w:szCs w:val="26"/>
-          <w:lang w:eastAsia="ko-KR"/>
+          <w:lang w:val="vi-VN" w:eastAsia="ko-KR"/>
         </w:rPr>
       </w:pPr>
       <w:r>
         <w:rPr>
           <w:rFonts w:cs="Times New Roman"/>
+          <w:b/>
+          <w:bCs/>
           <w:sz w:val="26"/>
           <w:szCs w:val="26"/>
-          <w:lang w:eastAsia="ko-KR"/>
+          <w:lang w:val="vi-VN" w:eastAsia="ko-KR"/>
         </w:rPr>
         <w:t>Mục tiêu khi tham gia CLB:</w:t>
-      </w:r>
-      <w:r>
-        <w:rPr>
-          <w:rFonts w:cs="Times New Roman"/>
-          <w:sz w:val="26"/>
-          <w:szCs w:val="26"/>
-          <w:lang w:eastAsia="ko-KR"/>
-        </w:rPr>
-        <w:t xml:space="preserve"> </w:t>
       </w:r>
       <w:r>
         <w:rPr>
@@ -3973,76 +3256,16 @@
           <w:szCs w:val="26"/>
           <w:lang w:val="vi-VN" w:eastAsia="ko-KR"/>
         </w:rPr>
-        <w:tab/>
-      </w:r>
-    </w:p>
-    <w:p>
-      <w:pPr>
-        <w:tabs>
-          <w:tab w:val="left" w:leader="dot" w:pos="9072"/>
-        </w:tabs>
-        <w:ind w:left="720"/>
+        <w:t xml:space="preserve"> </w:t>
+      </w:r>
+      <w:r>
         <w:rPr>
           <w:rFonts w:cs="Times New Roman"/>
           <w:sz w:val="26"/>
           <w:szCs w:val="26"/>
           <w:lang w:val="vi-VN" w:eastAsia="ko-KR"/>
         </w:rPr>
-      </w:pPr>
-      <w:r>
-        <w:rPr>
-          <w:rFonts w:cs="Times New Roman"/>
-          <w:sz w:val="26"/>
-          <w:szCs w:val="26"/>
-          <w:lang w:val="vi-VN" w:eastAsia="ko-KR"/>
-        </w:rPr>
-        <w:tab/>
-      </w:r>
-    </w:p>
-    <w:p>
-      <w:pPr>
-        <w:tabs>
-          <w:tab w:val="left" w:leader="dot" w:pos="9072"/>
-        </w:tabs>
-        <w:ind w:left="720"/>
-        <w:rPr>
-          <w:rFonts w:cs="Times New Roman"/>
-          <w:sz w:val="26"/>
-          <w:szCs w:val="26"/>
-          <w:lang w:val="vi-VN" w:eastAsia="ko-KR"/>
-        </w:rPr>
-      </w:pPr>
-      <w:r>
-        <w:rPr>
-          <w:rFonts w:cs="Times New Roman"/>
-          <w:sz w:val="26"/>
-          <w:szCs w:val="26"/>
-          <w:lang w:val="vi-VN" w:eastAsia="ko-KR"/>
-        </w:rPr>
-        <w:tab/>
-      </w:r>
-    </w:p>
-    <w:p>
-      <w:pPr>
-        <w:tabs>
-          <w:tab w:val="left" w:leader="dot" w:pos="9072"/>
-        </w:tabs>
-        <w:ind w:left="720"/>
-        <w:rPr>
-          <w:rFonts w:cs="Times New Roman"/>
-          <w:sz w:val="26"/>
-          <w:szCs w:val="26"/>
-          <w:lang w:eastAsia="ko-KR"/>
-        </w:rPr>
-      </w:pPr>
-      <w:r>
-        <w:rPr>
-          <w:rFonts w:cs="Times New Roman"/>
-          <w:sz w:val="26"/>
-          <w:szCs w:val="26"/>
-          <w:lang w:val="vi-VN" w:eastAsia="ko-KR"/>
-        </w:rPr>
-        <w:tab/>
+        <w:t>{{ muc_tieu }}</w:t>
       </w:r>
     </w:p>
     <w:p>
@@ -4058,26 +3281,19 @@
           <w:rFonts w:cs="Times New Roman"/>
           <w:sz w:val="26"/>
           <w:szCs w:val="26"/>
-          <w:lang w:eastAsia="ko-KR"/>
+          <w:lang w:val="vi-VN" w:eastAsia="ko-KR"/>
         </w:rPr>
       </w:pPr>
       <w:r>
         <w:rPr>
           <w:rFonts w:cs="Times New Roman"/>
+          <w:b/>
+          <w:bCs/>
           <w:sz w:val="26"/>
           <w:szCs w:val="26"/>
-          <w:lang w:eastAsia="ko-KR"/>
+          <w:lang w:val="vi-VN" w:eastAsia="ko-KR"/>
         </w:rPr>
         <w:t>Định hướng phát triển cá nhân:</w:t>
-      </w:r>
-      <w:r>
-        <w:rPr>
-          <w:rFonts w:cs="Times New Roman"/>
-          <w:sz w:val="26"/>
-          <w:szCs w:val="26"/>
-          <w:lang w:eastAsia="ko-KR"/>
-        </w:rPr>
-        <w:t xml:space="preserve"> </w:t>
       </w:r>
       <w:r>
         <w:rPr>
@@ -4086,94 +3302,34 @@
           <w:szCs w:val="26"/>
           <w:lang w:val="vi-VN" w:eastAsia="ko-KR"/>
         </w:rPr>
-        <w:tab/>
-      </w:r>
-    </w:p>
-    <w:p>
-      <w:pPr>
-        <w:tabs>
-          <w:tab w:val="left" w:leader="dot" w:pos="9072"/>
-        </w:tabs>
-        <w:ind w:left="720"/>
+        <w:t xml:space="preserve"> </w:t>
+      </w:r>
+      <w:r>
         <w:rPr>
           <w:rFonts w:cs="Times New Roman"/>
           <w:sz w:val="26"/>
           <w:szCs w:val="26"/>
           <w:lang w:val="vi-VN" w:eastAsia="ko-KR"/>
         </w:rPr>
-      </w:pPr>
-      <w:r>
+        <w:t>{{ dinh_huong }}</w:t>
+      </w:r>
+    </w:p>
+    <w:p>
+      <w:pPr>
+        <w:ind w:firstLine="709"/>
         <w:rPr>
           <w:rFonts w:cs="Times New Roman"/>
           <w:sz w:val="26"/>
           <w:szCs w:val="26"/>
           <w:lang w:val="vi-VN" w:eastAsia="ko-KR"/>
         </w:rPr>
-        <w:tab/>
-      </w:r>
-    </w:p>
-    <w:p>
-      <w:pPr>
-        <w:tabs>
-          <w:tab w:val="left" w:leader="dot" w:pos="9072"/>
-        </w:tabs>
-        <w:ind w:left="720"/>
+      </w:pPr>
+      <w:r>
         <w:rPr>
           <w:rFonts w:cs="Times New Roman"/>
           <w:sz w:val="26"/>
           <w:szCs w:val="26"/>
           <w:lang w:val="vi-VN" w:eastAsia="ko-KR"/>
-        </w:rPr>
-      </w:pPr>
-      <w:r>
-        <w:rPr>
-          <w:rFonts w:cs="Times New Roman"/>
-          <w:sz w:val="26"/>
-          <w:szCs w:val="26"/>
-          <w:lang w:val="vi-VN" w:eastAsia="ko-KR"/>
-        </w:rPr>
-        <w:tab/>
-      </w:r>
-    </w:p>
-    <w:p>
-      <w:pPr>
-        <w:tabs>
-          <w:tab w:val="left" w:leader="dot" w:pos="9072"/>
-        </w:tabs>
-        <w:ind w:left="720"/>
-        <w:rPr>
-          <w:rFonts w:cs="Times New Roman"/>
-          <w:sz w:val="26"/>
-          <w:szCs w:val="26"/>
-          <w:lang w:eastAsia="ko-KR"/>
-        </w:rPr>
-      </w:pPr>
-      <w:r>
-        <w:rPr>
-          <w:rFonts w:cs="Times New Roman"/>
-          <w:sz w:val="26"/>
-          <w:szCs w:val="26"/>
-          <w:lang w:val="vi-VN" w:eastAsia="ko-KR"/>
-        </w:rPr>
-        <w:tab/>
-      </w:r>
-    </w:p>
-    <w:p>
-      <w:pPr>
-        <w:ind w:firstLine="709"/>
-        <w:rPr>
-          <w:rFonts w:cs="Times New Roman"/>
-          <w:sz w:val="26"/>
-          <w:szCs w:val="26"/>
-          <w:lang w:eastAsia="ko-KR"/>
-        </w:rPr>
-      </w:pPr>
-      <w:r>
-        <w:rPr>
-          <w:rFonts w:cs="Times New Roman"/>
-          <w:sz w:val="26"/>
-          <w:szCs w:val="26"/>
-          <w:lang w:eastAsia="ko-KR"/>
         </w:rPr>
         <w:t>Tôi cam kết những thông tin trên là đúng sự thật. Tôi chịu trách nhiệm về tính chính xác của nội dung đã cung cấp.</w:t>
       </w:r>
@@ -4325,6 +3481,7 @@
                 <w:iCs/>
                 <w:sz w:val="26"/>
               </w:rPr>
+              <w:lastRenderedPageBreak/>
               <w:t>(Ký và ghi rõ họ tên)</w:t>
             </w:r>
           </w:p>
@@ -4432,10 +3589,7 @@
               </w:rPr>
             </w:pPr>
             <w:r>
-              <w:rPr>
-                <w:sz w:val="26"/>
-              </w:rPr>
-              <w:t>……………………………</w:t>
+              <w:t>{{ ho_ten }}</w:t>
             </w:r>
           </w:p>
         </w:tc>
@@ -4477,13 +3631,7 @@
         <w:rPr>
           <w:lang w:val="vi-VN"/>
         </w:rPr>
-        <w:t xml:space="preserve">VÀ </w:t>
-      </w:r>
-      <w:r>
-        <w:rPr>
-          <w:lang w:val="vi-VN"/>
-        </w:rPr>
-        <w:t xml:space="preserve">HƯỚNG DẪN </w:t>
+        <w:t xml:space="preserve">VÀ HƯỚNG DẪN </w:t>
       </w:r>
       <w:r>
         <w:rPr>
@@ -5464,49 +4612,7 @@
           <w:rFonts w:ascii="Consolas" w:hAnsi="Consolas"/>
           <w:lang w:val="vi-VN"/>
         </w:rPr>
-        <w:t xml:space="preserve"> </w:t>
-      </w:r>
-      <w:r>
-        <w:rPr>
-          <w:rFonts w:ascii="Consolas" w:hAnsi="Consolas"/>
-          <w:lang w:val="vi-VN"/>
-        </w:rPr>
-        <w:t xml:space="preserve">HOSOTHANHVIEN </w:t>
-      </w:r>
-      <w:r>
-        <w:rPr>
-          <w:rFonts w:ascii="Consolas" w:hAnsi="Consolas"/>
-          <w:lang w:val="vi-VN"/>
-        </w:rPr>
-        <w:t>–</w:t>
-      </w:r>
-      <w:r>
-        <w:rPr>
-          <w:rFonts w:ascii="Consolas" w:hAnsi="Consolas"/>
-          <w:lang w:val="vi-VN"/>
-        </w:rPr>
-        <w:t xml:space="preserve"> </w:t>
-      </w:r>
-      <w:r>
-        <w:rPr>
-          <w:rFonts w:ascii="Consolas" w:hAnsi="Consolas"/>
-          <w:lang w:val="vi-VN"/>
-        </w:rPr>
-        <w:t>NGUYEN-VAN-A_2412345678</w:t>
-      </w:r>
-      <w:r>
-        <w:rPr>
-          <w:rFonts w:ascii="Consolas" w:hAnsi="Consolas"/>
-          <w:lang w:val="vi-VN"/>
-        </w:rPr>
-        <w:t xml:space="preserve"> – </w:t>
-      </w:r>
-      <w:r>
-        <w:rPr>
-          <w:rFonts w:ascii="Consolas" w:hAnsi="Consolas"/>
-          <w:lang w:val="vi-VN"/>
-        </w:rPr>
-        <w:t>2026</w:t>
+        <w:t xml:space="preserve"> HOSOTHANHVIEN – NGUYEN-VAN-A_2412345678 – 2026</w:t>
       </w:r>
       <w:r>
         <w:rPr>
@@ -5691,7 +4797,6 @@
         <w:docPartUnique/>
       </w:docPartObj>
     </w:sdtPr>
-    <w:sdtEndPr/>
     <w:sdtContent>
       <w:p>
         <w:pPr>
@@ -5742,7 +4847,7 @@
             <w:noProof/>
             <w:lang w:val="vi-VN"/>
           </w:rPr>
-          <w:t>2</w:t>
+          <w:t>3</w:t>
         </w:r>
         <w:r>
           <w:rPr>
@@ -5895,7 +5000,7 @@
       <mc:AlternateContent>
         <mc:Choice Requires="wps">
           <w:drawing>
-            <wp:anchor distT="0" distB="0" distL="114300" distR="114300" simplePos="0" relativeHeight="251659264" behindDoc="0" locked="0" layoutInCell="1" allowOverlap="1" wp14:anchorId="046C7FD6" wp14:editId="5170E2F9">
+            <wp:anchor distT="0" distB="0" distL="114300" distR="114300" simplePos="0" relativeHeight="251658752" behindDoc="0" locked="0" layoutInCell="1" allowOverlap="1" wp14:anchorId="046C7FD6" wp14:editId="5170E2F9">
               <wp:simplePos x="0" y="0"/>
               <wp:positionH relativeFrom="column">
                 <wp:posOffset>13970</wp:posOffset>
@@ -5967,7 +5072,7 @@
               <v:stroke joinstyle="miter"/>
               <v:path gradientshapeok="t" o:connecttype="rect"/>
             </v:shapetype>
-            <v:shape id="Text Box 2" o:spid="_x0000_s1027" type="#_x0000_t202" style="position:absolute;left:0;text-align:left;margin-left:1.1pt;margin-top:-10.6pt;width:138.85pt;height:21.85pt;z-index:251659264;visibility:visible;mso-wrap-style:square;mso-width-percent:0;mso-wrap-distance-left:9pt;mso-wrap-distance-top:0;mso-wrap-distance-right:9pt;mso-wrap-distance-bottom:0;mso-position-horizontal:absolute;mso-position-horizontal-relative:text;mso-position-vertical:absolute;mso-position-vertical-relative:text;mso-width-percent:0;mso-width-relative:margin;v-text-anchor:middle" o:gfxdata="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" fillcolor="window" strokeweight=".5pt">
+            <v:shape id="Text Box 2" o:spid="_x0000_s1027" type="#_x0000_t202" style="position:absolute;left:0;text-align:left;margin-left:1.1pt;margin-top:-10.6pt;width:138.85pt;height:21.85pt;z-index:251658752;visibility:visible;mso-wrap-style:square;mso-width-percent:0;mso-wrap-distance-left:9pt;mso-wrap-distance-top:0;mso-wrap-distance-right:9pt;mso-wrap-distance-bottom:0;mso-position-horizontal:absolute;mso-position-horizontal-relative:text;mso-position-vertical:absolute;mso-position-vertical-relative:text;mso-width-percent:0;mso-width-relative:margin;v-text-anchor:middle" o:gfxdata="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" fillcolor="window" strokeweight=".5pt">
               <v:textbox>
                 <w:txbxContent>
                   <w:p>
@@ -10284,6 +9389,7 @@
   <w:style w:type="character" w:default="1" w:styleId="DefaultParagraphFont">
     <w:name w:val="Default Paragraph Font"/>
     <w:uiPriority w:val="1"/>
+    <w:semiHidden/>
     <w:unhideWhenUsed/>
   </w:style>
   <w:style w:type="table" w:default="1" w:styleId="TableNormal">
@@ -10782,6 +9888,20 @@
       <w:shd w:val="clear" w:color="auto" w:fill="E1DFDD"/>
     </w:rPr>
   </w:style>
+  <w:style w:type="paragraph" w:styleId="NoSpacing">
+    <w:name w:val="No Spacing"/>
+    <w:autoRedefine/>
+    <w:uiPriority w:val="1"/>
+    <w:qFormat/>
+    <w:rsid w:val="005B5C3B"/>
+    <w:pPr>
+      <w:spacing w:after="0" w:line="240" w:lineRule="auto"/>
+      <w:jc w:val="center"/>
+    </w:pPr>
+    <w:rPr>
+      <w:rFonts w:ascii="Times New Roman" w:hAnsi="Times New Roman"/>
+    </w:rPr>
+  </w:style>
 </w:styles>
 </file>
 

</xml_diff>